<commit_message>
Refactor patient booking and queue management logic
- Removed redundant checks for existing bookings and slot capacity in handlePatientService.java.
- Simplified notification logic for successful bookings.
- Enhanced queue management in handleStaffProcess.java with new actions for next and skip queue numbers.
- Updated styles in CSS for better visual feedback on error and success messages.
- Cleaned up JSP files by removing unnecessary error handling and feedback messages.
- Improved user experience in walk-in queue and service selection pages with live updates and better form handling.
- Consolidated user management functionalities in admin and staff pages for consistency.
</commit_message>
<xml_diff>
--- a/AY2526-ITP4511-Project-Brief.docx
+++ b/AY2526-ITP4511-Project-Brief.docx
@@ -1266,9 +1266,9 @@
       </w:r>
       <w:r>
         <w:rPr>
-          <w:rFonts w:ascii="Segoe UI Symbol" w:eastAsia="新細明體" w:hAnsi="Segoe UI Symbol" w:cs="Segoe UI Symbol"/>
-        </w:rPr>
-        <w:t>☑</w:t>
+          <w:rFonts w:ascii="Segoe UI Symbol" w:hAnsi="Segoe UI Symbol" w:cs="Segoe UI Symbol"/>
+        </w:rPr>
+        <w:t>☐</w:t>
       </w:r>
     </w:p>
     <w:p>
@@ -1366,9 +1366,9 @@
       </w:r>
       <w:r>
         <w:rPr>
-          <w:rFonts w:ascii="Segoe UI Symbol" w:eastAsia="新細明體" w:hAnsi="Segoe UI Symbol" w:cs="Segoe UI Symbol"/>
-        </w:rPr>
-        <w:t>☑</w:t>
+          <w:rFonts w:ascii="Segoe UI Symbol" w:hAnsi="Segoe UI Symbol" w:cs="Segoe UI Symbol"/>
+        </w:rPr>
+        <w:t>☐</w:t>
       </w:r>
     </w:p>
     <w:p>
@@ -1636,14 +1636,6 @@
         </w:rPr>
         <w:t>Display list of clinics and services</w:t>
       </w:r>
-      <w:r>
-        <w:rPr>
-          <w:rFonts w:ascii="Segoe UI Symbol" w:eastAsia="新細明體" w:hAnsi="Segoe UI Symbol" w:cs="Segoe UI Symbol"/>
-          <w:bdr w:val="none" w:sz="0" w:space="0" w:color="auto"/>
-          <w:lang w:eastAsia="zh-TW"/>
-        </w:rPr>
-        <w:t>☑</w:t>
-      </w:r>
     </w:p>
     <w:p>
       <w:pPr>
@@ -1663,14 +1655,6 @@
         </w:rPr>
         <w:t>Filter by clinic, service type, date, and availability</w:t>
       </w:r>
-      <w:r>
-        <w:rPr>
-          <w:rFonts w:ascii="Segoe UI Symbol" w:eastAsia="新細明體" w:hAnsi="Segoe UI Symbol" w:cs="Segoe UI Symbol"/>
-          <w:bdr w:val="none" w:sz="0" w:space="0" w:color="auto"/>
-          <w:lang w:eastAsia="zh-TW"/>
-        </w:rPr>
-        <w:t>☑</w:t>
-      </w:r>
     </w:p>
     <w:p>
       <w:pPr>
@@ -1719,14 +1703,6 @@
         </w:rPr>
         <w:t>Patients select a clinic, service, date, and available time slot</w:t>
       </w:r>
-      <w:r>
-        <w:rPr>
-          <w:rFonts w:ascii="Segoe UI Symbol" w:eastAsia="新細明體" w:hAnsi="Segoe UI Symbol" w:cs="Segoe UI Symbol"/>
-          <w:bdr w:val="none" w:sz="0" w:space="0" w:color="auto"/>
-          <w:lang w:eastAsia="zh-TW"/>
-        </w:rPr>
-        <w:t>☑</w:t>
-      </w:r>
     </w:p>
     <w:p>
       <w:pPr>
@@ -1765,14 +1741,6 @@
         </w:rPr>
         <w:t>Booking confirmation page and record saved</w:t>
       </w:r>
-      <w:r>
-        <w:rPr>
-          <w:rFonts w:ascii="Segoe UI Symbol" w:eastAsia="新細明體" w:hAnsi="Segoe UI Symbol" w:cs="Segoe UI Symbol"/>
-          <w:bdr w:val="none" w:sz="0" w:space="0" w:color="auto"/>
-          <w:lang w:eastAsia="zh-TW"/>
-        </w:rPr>
-        <w:t>☑</w:t>
-      </w:r>
     </w:p>
     <w:p>
       <w:pPr>
@@ -1821,22 +1789,6 @@
         </w:rPr>
         <w:t>Patients reschedule within allowed rules (e.g., before cutoff time)</w:t>
       </w:r>
-      <w:r>
-        <w:rPr>
-          <w:rFonts w:ascii="Segoe UI Symbol" w:eastAsia="新細明體" w:hAnsi="Segoe UI Symbol" w:cs="Segoe UI Symbol"/>
-          <w:bdr w:val="none" w:sz="0" w:space="0" w:color="auto"/>
-          <w:lang w:eastAsia="zh-TW"/>
-        </w:rPr>
-        <w:t xml:space="preserve"> </w:t>
-      </w:r>
-      <w:r>
-        <w:rPr>
-          <w:rFonts w:ascii="Segoe UI Symbol" w:eastAsia="新細明體" w:hAnsi="Segoe UI Symbol" w:cs="Segoe UI Symbol"/>
-          <w:bdr w:val="none" w:sz="0" w:space="0" w:color="auto"/>
-          <w:lang w:eastAsia="zh-TW"/>
-        </w:rPr>
-        <w:t>☑</w:t>
-      </w:r>
     </w:p>
     <w:p>
       <w:pPr>
@@ -1855,14 +1807,6 @@
           <w:lang w:eastAsia="zh-TW"/>
         </w:rPr>
         <w:t>Patients cancel bookings, freeing the slot</w:t>
-      </w:r>
-      <w:r>
-        <w:rPr>
-          <w:rFonts w:ascii="Segoe UI Symbol" w:eastAsia="新細明體" w:hAnsi="Segoe UI Symbol" w:cs="Segoe UI Symbol"/>
-          <w:bdr w:val="none" w:sz="0" w:space="0" w:color="auto"/>
-          <w:lang w:eastAsia="zh-TW"/>
-        </w:rPr>
-        <w:t>☑</w:t>
       </w:r>
     </w:p>
     <w:p>
@@ -2037,14 +1981,6 @@
         </w:rPr>
         <w:t>Patients join same-day queue for a clinic/service if enabled</w:t>
       </w:r>
-      <w:r>
-        <w:rPr>
-          <w:rFonts w:ascii="Segoe UI Symbol" w:eastAsia="新細明體" w:hAnsi="Segoe UI Symbol" w:cs="Segoe UI Symbol"/>
-          <w:bdr w:val="none" w:sz="0" w:space="0" w:color="auto"/>
-          <w:lang w:eastAsia="zh-TW"/>
-        </w:rPr>
-        <w:t>☑</w:t>
-      </w:r>
     </w:p>
     <w:p>
       <w:pPr>
@@ -2120,6 +2056,7 @@
         <w:rPr>
           <w:lang w:eastAsia="zh-TW"/>
         </w:rPr>
+        <w:lastRenderedPageBreak/>
         <w:t>Staff call next, skip, or mark as served</w:t>
       </w:r>
     </w:p>
@@ -2292,14 +2229,6 @@
         </w:rPr>
         <w:t>Appointment confirmed or updated</w:t>
       </w:r>
-      <w:r>
-        <w:rPr>
-          <w:rFonts w:ascii="Segoe UI Symbol" w:eastAsia="新細明體" w:hAnsi="Segoe UI Symbol" w:cs="Segoe UI Symbol"/>
-          <w:bdr w:val="none" w:sz="0" w:space="0" w:color="auto"/>
-          <w:lang w:eastAsia="zh-TW"/>
-        </w:rPr>
-        <w:t>☑</w:t>
-      </w:r>
     </w:p>
     <w:p>
       <w:pPr>
@@ -3026,7 +2955,6 @@
         <w:rPr>
           <w:lang w:eastAsia="zh-TW"/>
         </w:rPr>
-        <w:lastRenderedPageBreak/>
         <w:t xml:space="preserve">Audit trail table for staff actions </w:t>
       </w:r>
       <w:r>
@@ -10020,7 +9948,6 @@
   <w:style w:type="character" w:default="1" w:styleId="DefaultParagraphFont">
     <w:name w:val="Default Paragraph Font"/>
     <w:uiPriority w:val="1"/>
-    <w:semiHidden/>
     <w:unhideWhenUsed/>
   </w:style>
   <w:style w:type="table" w:default="1" w:styleId="TableNormal">

</xml_diff>

<commit_message>
message # with '#' will be ignored, and an empty message aborts the commit.
</commit_message>
<xml_diff>
--- a/AY2526-ITP4511-Project-Brief.docx
+++ b/AY2526-ITP4511-Project-Brief.docx
@@ -1425,9 +1425,9 @@
       </w:r>
       <w:r>
         <w:rPr>
-          <w:rFonts w:ascii="Segoe UI Symbol" w:hAnsi="Segoe UI Symbol" w:cs="Segoe UI Symbol"/>
-        </w:rPr>
-        <w:t>☐</w:t>
+          <w:rFonts w:ascii="Segoe UI Symbol" w:eastAsia="新細明體" w:hAnsi="Segoe UI Symbol" w:cs="Segoe UI Symbol"/>
+        </w:rPr>
+        <w:t>☑</w:t>
       </w:r>
     </w:p>
     <w:p>
@@ -2062,7 +2062,21 @@
         <w:rPr>
           <w:lang w:eastAsia="zh-TW"/>
         </w:rPr>
-        <w:t>System assigns a queue number and estimated waiting time (simple estimate acceptable)</w:t>
+        <w:t xml:space="preserve">System assigns a queue number and </w:t>
+      </w:r>
+      <w:proofErr w:type="gramStart"/>
+      <w:r>
+        <w:rPr>
+          <w:lang w:eastAsia="zh-TW"/>
+        </w:rPr>
+        <w:t>estimated</w:t>
+      </w:r>
+      <w:proofErr w:type="gramEnd"/>
+      <w:r>
+        <w:rPr>
+          <w:lang w:eastAsia="zh-TW"/>
+        </w:rPr>
+        <w:t xml:space="preserve"> waiting time (simple estimate acceptable)</w:t>
       </w:r>
     </w:p>
     <w:p>
@@ -2698,6 +2712,21 @@
         </w:rPr>
         <w:t>List users</w:t>
       </w:r>
+      <w:r>
+        <w:rPr>
+          <w:rFonts w:hint="eastAsia"/>
+          <w:lang w:eastAsia="zh-TW"/>
+        </w:rPr>
+        <w:t xml:space="preserve"> </w:t>
+      </w:r>
+      <w:r>
+        <w:rPr>
+          <w:rFonts w:ascii="Segoe UI Symbol" w:eastAsia="新細明體" w:hAnsi="Segoe UI Symbol" w:cs="Segoe UI Symbol"/>
+          <w:bdr w:val="none" w:sz="0" w:space="0" w:color="auto"/>
+          <w:lang w:eastAsia="zh-TW"/>
+        </w:rPr>
+        <w:t>☑</w:t>
+      </w:r>
     </w:p>
     <w:p>
       <w:pPr>
@@ -2717,6 +2746,21 @@
         </w:rPr>
         <w:t>Create, edit, or delete users</w:t>
       </w:r>
+      <w:r>
+        <w:rPr>
+          <w:rFonts w:hint="eastAsia"/>
+          <w:lang w:eastAsia="zh-TW"/>
+        </w:rPr>
+        <w:t xml:space="preserve"> </w:t>
+      </w:r>
+      <w:r>
+        <w:rPr>
+          <w:rFonts w:ascii="Segoe UI Symbol" w:eastAsia="新細明體" w:hAnsi="Segoe UI Symbol" w:cs="Segoe UI Symbol"/>
+          <w:bdr w:val="none" w:sz="0" w:space="0" w:color="auto"/>
+          <w:lang w:eastAsia="zh-TW"/>
+        </w:rPr>
+        <w:t>☑</w:t>
+      </w:r>
     </w:p>
     <w:p>
       <w:pPr>
@@ -2736,6 +2780,21 @@
         </w:rPr>
         <w:t>Assign roles and clinic links for staff (if applicable)</w:t>
       </w:r>
+      <w:r>
+        <w:rPr>
+          <w:rFonts w:hint="eastAsia"/>
+          <w:lang w:eastAsia="zh-TW"/>
+        </w:rPr>
+        <w:t xml:space="preserve"> </w:t>
+      </w:r>
+      <w:r>
+        <w:rPr>
+          <w:rFonts w:ascii="Segoe UI Symbol" w:eastAsia="新細明體" w:hAnsi="Segoe UI Symbol" w:cs="Segoe UI Symbol"/>
+          <w:bdr w:val="none" w:sz="0" w:space="0" w:color="auto"/>
+          <w:lang w:eastAsia="zh-TW"/>
+        </w:rPr>
+        <w:t>☑</w:t>
+      </w:r>
     </w:p>
     <w:p>
       <w:pPr>
@@ -2781,6 +2840,14 @@
           <w:lang w:eastAsia="zh-TW"/>
         </w:rPr>
         <w:t>Update passwords and personal details</w:t>
+      </w:r>
+      <w:r>
+        <w:rPr>
+          <w:rFonts w:ascii="Segoe UI Symbol" w:eastAsia="新細明體" w:hAnsi="Segoe UI Symbol" w:cs="Segoe UI Symbol"/>
+          <w:bdr w:val="none" w:sz="0" w:space="0" w:color="auto"/>
+          <w:lang w:eastAsia="zh-TW"/>
+        </w:rPr>
+        <w:t>☑</w:t>
       </w:r>
     </w:p>
     <w:p>
@@ -4021,7 +4088,25 @@
                 <w:sz w:val="24"/>
                 <w:szCs w:val="24"/>
               </w:rPr>
-              <w:t>Work break down</w:t>
+              <w:t xml:space="preserve">Work </w:t>
+            </w:r>
+            <w:proofErr w:type="gramStart"/>
+            <w:r>
+              <w:rPr>
+                <w:rFonts w:ascii="Times New Roman" w:hAnsi="Times New Roman"/>
+                <w:sz w:val="24"/>
+                <w:szCs w:val="24"/>
+              </w:rPr>
+              <w:t>break</w:t>
+            </w:r>
+            <w:proofErr w:type="gramEnd"/>
+            <w:r>
+              <w:rPr>
+                <w:rFonts w:ascii="Times New Roman" w:hAnsi="Times New Roman"/>
+                <w:sz w:val="24"/>
+                <w:szCs w:val="24"/>
+              </w:rPr>
+              <w:t xml:space="preserve"> down</w:t>
             </w:r>
           </w:p>
         </w:tc>
@@ -4456,7 +4541,21 @@
         <w:rPr>
           <w:rFonts w:ascii="Times New Roman" w:hAnsi="Times New Roman"/>
         </w:rPr>
-        <w:t>Use JSP/servlets to accept user inputs from browser</w:t>
+        <w:t xml:space="preserve">Use JSP/servlets to accept user </w:t>
+      </w:r>
+      <w:proofErr w:type="gramStart"/>
+      <w:r>
+        <w:rPr>
+          <w:rFonts w:ascii="Times New Roman" w:hAnsi="Times New Roman"/>
+        </w:rPr>
+        <w:t>inputs</w:t>
+      </w:r>
+      <w:proofErr w:type="gramEnd"/>
+      <w:r>
+        <w:rPr>
+          <w:rFonts w:ascii="Times New Roman" w:hAnsi="Times New Roman"/>
+        </w:rPr>
+        <w:t xml:space="preserve"> from browser</w:t>
       </w:r>
     </w:p>
     <w:p>
@@ -4507,6 +4606,7 @@
         </w:rPr>
         <w:t xml:space="preserve"> (</w:t>
       </w:r>
+      <w:proofErr w:type="spellStart"/>
       <w:r>
         <w:rPr>
           <w:rFonts w:ascii="Times New Roman" w:hAnsi="Times New Roman"/>
@@ -4517,7 +4617,14 @@
         <w:rPr>
           <w:rFonts w:ascii="Times New Roman" w:hAnsi="Times New Roman"/>
         </w:rPr>
-        <w:t>aglib).</w:t>
+        <w:t>aglib</w:t>
+      </w:r>
+      <w:proofErr w:type="spellEnd"/>
+      <w:r>
+        <w:rPr>
+          <w:rFonts w:ascii="Times New Roman" w:hAnsi="Times New Roman"/>
+        </w:rPr>
+        <w:t>).</w:t>
       </w:r>
     </w:p>
     <w:p>

</xml_diff>

<commit_message>
Update project brief with user role annotations and clarify queue management details
</commit_message>
<xml_diff>
--- a/AY2526-ITP4511-Project-Brief.docx
+++ b/AY2526-ITP4511-Project-Brief.docx
@@ -1,6 +1,6 @@
 
 <file path=word/document.xml><?xml version="1.0" encoding="utf-8"?>
-<w:document xmlns:wpc="http://schemas.microsoft.com/office/word/2010/wordprocessingCanvas" xmlns:cx="http://schemas.microsoft.com/office/drawing/2014/chartex" xmlns:cx1="http://schemas.microsoft.com/office/drawing/2015/9/8/chartex" xmlns:cx2="http://schemas.microsoft.com/office/drawing/2015/10/21/chartex" xmlns:cx3="http://schemas.microsoft.com/office/drawing/2016/5/9/chartex" xmlns:cx4="http://schemas.microsoft.com/office/drawing/2016/5/10/chartex" xmlns:cx5="http://schemas.microsoft.com/office/drawing/2016/5/11/chartex" xmlns:cx6="http://schemas.microsoft.com/office/drawing/2016/5/12/chartex" xmlns:cx7="http://schemas.microsoft.com/office/drawing/2016/5/13/chartex" xmlns:cx8="http://schemas.microsoft.com/office/drawing/2016/5/14/chartex" xmlns:mc="http://schemas.openxmlformats.org/markup-compatibility/2006" xmlns:aink="http://schemas.microsoft.com/office/drawing/2016/ink" xmlns:am3d="http://schemas.microsoft.com/office/drawing/2017/model3d" xmlns:o="urn:schemas-microsoft-com:office:office" xmlns:oel="http://schemas.microsoft.com/office/2019/extlst" xmlns:r="http://schemas.openxmlformats.org/officeDocument/2006/relationships" xmlns:m="http://schemas.openxmlformats.org/officeDocument/2006/math" xmlns:v="urn:schemas-microsoft-com:vml" xmlns:wp14="http://schemas.microsoft.com/office/word/2010/wordprocessingDrawing" xmlns:wp="http://schemas.openxmlformats.org/drawingml/2006/wordprocessingDrawing" xmlns:w10="urn:schemas-microsoft-com:office:word" xmlns:w="http://schemas.openxmlformats.org/wordprocessingml/2006/main" xmlns:w14="http://schemas.microsoft.com/office/word/2010/wordml" xmlns:w15="http://schemas.microsoft.com/office/word/2012/wordml" xmlns:w16cex="http://schemas.microsoft.com/office/word/2018/wordml/cex" xmlns:w16cid="http://schemas.microsoft.com/office/word/2016/wordml/cid" xmlns:w16="http://schemas.microsoft.com/office/word/2018/wordml" xmlns:w16du="http://schemas.microsoft.com/office/word/2023/wordml/word16du" xmlns:w16sdtdh="http://schemas.microsoft.com/office/word/2020/wordml/sdtdatahash" xmlns:w16sdtfl="http://schemas.microsoft.com/office/word/2024/wordml/sdtformatlock" xmlns:w16se="http://schemas.microsoft.com/office/word/2015/wordml/symex" xmlns:wpg="http://schemas.microsoft.com/office/word/2010/wordprocessingGroup" xmlns:wpi="http://schemas.microsoft.com/office/word/2010/wordprocessingInk" xmlns:wne="http://schemas.microsoft.com/office/word/2006/wordml" xmlns:wps="http://schemas.microsoft.com/office/word/2010/wordprocessingShape" mc:Ignorable="w14 w15 w16se w16cid w16 w16cex w16sdtdh w16sdtfl w16du wp14">
+<w:document xmlns:wpc="http://schemas.microsoft.com/office/word/2010/wordprocessingCanvas" xmlns:cx="http://schemas.microsoft.com/office/drawing/2014/chartex" xmlns:cx1="http://schemas.microsoft.com/office/drawing/2015/9/8/chartex" xmlns:cx2="http://schemas.microsoft.com/office/drawing/2015/10/21/chartex" xmlns:cx3="http://schemas.microsoft.com/office/drawing/2016/5/9/chartex" xmlns:cx4="http://schemas.microsoft.com/office/drawing/2016/5/10/chartex" xmlns:cx5="http://schemas.microsoft.com/office/drawing/2016/5/11/chartex" xmlns:cx6="http://schemas.microsoft.com/office/drawing/2016/5/12/chartex" xmlns:cx7="http://schemas.microsoft.com/office/drawing/2016/5/13/chartex" xmlns:cx8="http://schemas.microsoft.com/office/drawing/2016/5/14/chartex" xmlns:mc="http://schemas.openxmlformats.org/markup-compatibility/2006" xmlns:aink="http://schemas.microsoft.com/office/drawing/2016/ink" xmlns:am3d="http://schemas.microsoft.com/office/drawing/2017/model3d" xmlns:o="urn:schemas-microsoft-com:office:office" xmlns:r="http://schemas.openxmlformats.org/officeDocument/2006/relationships" xmlns:m="http://schemas.openxmlformats.org/officeDocument/2006/math" xmlns:v="urn:schemas-microsoft-com:vml" xmlns:wp14="http://schemas.microsoft.com/office/word/2010/wordprocessingDrawing" xmlns:wp="http://schemas.openxmlformats.org/drawingml/2006/wordprocessingDrawing" xmlns:w10="urn:schemas-microsoft-com:office:word" xmlns:w="http://schemas.openxmlformats.org/wordprocessingml/2006/main" xmlns:w14="http://schemas.microsoft.com/office/word/2010/wordml" xmlns:w15="http://schemas.microsoft.com/office/word/2012/wordml" xmlns:w16cex="http://schemas.microsoft.com/office/word/2018/wordml/cex" xmlns:w16cid="http://schemas.microsoft.com/office/word/2016/wordml/cid" xmlns:w16="http://schemas.microsoft.com/office/word/2018/wordml" xmlns:w16sdtdh="http://schemas.microsoft.com/office/word/2020/wordml/sdtdatahash" xmlns:w16se="http://schemas.microsoft.com/office/word/2015/wordml/symex" xmlns:wpg="http://schemas.microsoft.com/office/word/2010/wordprocessingGroup" xmlns:wpi="http://schemas.microsoft.com/office/word/2010/wordprocessingInk" xmlns:wne="http://schemas.microsoft.com/office/word/2006/wordml" xmlns:wps="http://schemas.microsoft.com/office/word/2010/wordprocessingShape" mc:Ignorable="w14 w15 w16se w16cid w16 w16cex w16sdtdh wp14">
   <w:body>
     <w:p>
       <w:pPr>
@@ -209,7 +209,7 @@
       <w:hyperlink r:id="rId7" w:history="1">
         <w:r>
           <w:rPr>
-            <w:rStyle w:val="Hyperlink"/>
+            <w:rStyle w:val="a3"/>
             <w:rFonts w:ascii="Times New Roman" w:hAnsi="Times New Roman"/>
           </w:rPr>
           <w:t>http://moodle.vtc.edu.hk</w:t>
@@ -473,7 +473,7 @@
     </w:p>
     <w:p>
       <w:pPr>
-        <w:pStyle w:val="Heading1"/>
+        <w:pStyle w:val="1"/>
         <w:jc w:val="both"/>
         <w:rPr>
           <w:lang w:val="it-IT"/>
@@ -496,7 +496,7 @@
     </w:p>
     <w:p>
       <w:pPr>
-        <w:pStyle w:val="Heading1"/>
+        <w:pStyle w:val="1"/>
         <w:jc w:val="both"/>
         <w:rPr>
           <w:rFonts w:ascii="Times New Roman" w:eastAsia="Arial Unicode MS" w:hAnsi="Times New Roman" w:cs="Arial Unicode MS"/>
@@ -580,7 +580,7 @@
     </w:p>
     <w:p>
       <w:pPr>
-        <w:pStyle w:val="Heading1"/>
+        <w:pStyle w:val="1"/>
         <w:jc w:val="both"/>
         <w:rPr>
           <w:rFonts w:ascii="Times New Roman" w:eastAsia="Arial Unicode MS" w:hAnsi="Times New Roman" w:cs="Arial Unicode MS"/>
@@ -613,7 +613,7 @@
     </w:p>
     <w:p>
       <w:pPr>
-        <w:pStyle w:val="Heading1"/>
+        <w:pStyle w:val="1"/>
         <w:jc w:val="both"/>
         <w:rPr>
           <w:rFonts w:ascii="Times New Roman" w:eastAsia="Arial Unicode MS" w:hAnsi="Times New Roman" w:cs="Arial Unicode MS"/>
@@ -646,7 +646,7 @@
     </w:p>
     <w:p>
       <w:pPr>
-        <w:pStyle w:val="Heading1"/>
+        <w:pStyle w:val="1"/>
         <w:jc w:val="both"/>
       </w:pPr>
       <w:r>
@@ -668,7 +668,7 @@
     </w:p>
     <w:p>
       <w:pPr>
-        <w:pStyle w:val="Heading1"/>
+        <w:pStyle w:val="1"/>
         <w:jc w:val="both"/>
         <w:rPr>
           <w:rFonts w:eastAsia="Arial Unicode MS" w:cs="Arial Unicode MS"/>
@@ -801,7 +801,7 @@
     </w:p>
     <w:p>
       <w:pPr>
-        <w:pStyle w:val="NormalWeb"/>
+        <w:pStyle w:val="Web"/>
         <w:numPr>
           <w:ilvl w:val="0"/>
           <w:numId w:val="5"/>
@@ -1285,7 +1285,7 @@
     </w:p>
     <w:p>
       <w:pPr>
-        <w:pStyle w:val="NormalWeb"/>
+        <w:pStyle w:val="Web"/>
         <w:numPr>
           <w:ilvl w:val="0"/>
           <w:numId w:val="6"/>
@@ -1318,7 +1318,7 @@
     </w:p>
     <w:p>
       <w:pPr>
-        <w:pStyle w:val="NormalWeb"/>
+        <w:pStyle w:val="Web"/>
         <w:numPr>
           <w:ilvl w:val="0"/>
           <w:numId w:val="6"/>
@@ -1343,7 +1343,7 @@
     </w:p>
     <w:p>
       <w:pPr>
-        <w:pStyle w:val="NormalWeb"/>
+        <w:pStyle w:val="Web"/>
         <w:numPr>
           <w:ilvl w:val="0"/>
           <w:numId w:val="6"/>
@@ -1368,7 +1368,7 @@
     </w:p>
     <w:p>
       <w:pPr>
-        <w:pStyle w:val="NormalWeb"/>
+        <w:pStyle w:val="Web"/>
         <w:numPr>
           <w:ilvl w:val="0"/>
           <w:numId w:val="6"/>
@@ -1393,7 +1393,7 @@
     </w:p>
     <w:p>
       <w:pPr>
-        <w:pStyle w:val="NormalWeb"/>
+        <w:pStyle w:val="Web"/>
         <w:numPr>
           <w:ilvl w:val="0"/>
           <w:numId w:val="6"/>
@@ -1460,7 +1460,7 @@
     </w:p>
     <w:p>
       <w:pPr>
-        <w:pStyle w:val="NormalWeb"/>
+        <w:pStyle w:val="Web"/>
         <w:numPr>
           <w:ilvl w:val="0"/>
           <w:numId w:val="7"/>
@@ -1493,7 +1493,7 @@
     </w:p>
     <w:p>
       <w:pPr>
-        <w:pStyle w:val="NormalWeb"/>
+        <w:pStyle w:val="Web"/>
         <w:numPr>
           <w:ilvl w:val="0"/>
           <w:numId w:val="7"/>
@@ -1518,12 +1518,15 @@
     </w:p>
     <w:p>
       <w:pPr>
-        <w:pStyle w:val="NormalWeb"/>
+        <w:pStyle w:val="Web"/>
         <w:numPr>
           <w:ilvl w:val="0"/>
           <w:numId w:val="7"/>
         </w:numPr>
         <w:jc w:val="both"/>
+        <w:rPr>
+          <w:highlight w:val="yellow"/>
+        </w:rPr>
       </w:pPr>
       <w:r>
         <w:t>View analytics and generate reports (per clinic/service/month)</w:t>
@@ -1540,15 +1543,39 @@
         </w:rPr>
         <w:t>☐</w:t>
       </w:r>
-    </w:p>
-    <w:p>
-      <w:pPr>
-        <w:pStyle w:val="NormalWeb"/>
+      <w:r>
+        <w:rPr>
+          <w:rFonts w:ascii="Segoe UI Symbol" w:hAnsi="Segoe UI Symbol" w:cs="Segoe UI Symbol"/>
+        </w:rPr>
+        <w:t xml:space="preserve"> </w:t>
+      </w:r>
+      <w:r>
+        <w:rPr>
+          <w:rFonts w:ascii="Segoe UI Symbol" w:hAnsi="Segoe UI Symbol" w:cs="Segoe UI Symbol"/>
+          <w:highlight w:val="yellow"/>
+        </w:rPr>
+        <w:t>S</w:t>
+      </w:r>
+      <w:r>
+        <w:rPr>
+          <w:rFonts w:ascii="Segoe UI Symbol" w:hAnsi="Segoe UI Symbol" w:cs="Segoe UI Symbol"/>
+          <w:highlight w:val="yellow"/>
+        </w:rPr>
+        <w:t>lt8ky</w:t>
+      </w:r>
+    </w:p>
+    <w:p>
+      <w:pPr>
+        <w:pStyle w:val="Web"/>
         <w:numPr>
           <w:ilvl w:val="0"/>
           <w:numId w:val="7"/>
         </w:numPr>
         <w:jc w:val="both"/>
+        <w:rPr>
+          <w:rFonts w:hint="eastAsia"/>
+          <w:highlight w:val="yellow"/>
+        </w:rPr>
       </w:pPr>
       <w:r>
         <w:t>Review incident logs (e.g., repeated no-shows, frequent cancellations)</w:t>
@@ -1565,15 +1592,31 @@
         </w:rPr>
         <w:t>☐</w:t>
       </w:r>
-    </w:p>
-    <w:p>
-      <w:pPr>
-        <w:pStyle w:val="NormalWeb"/>
+      <w:r>
+        <w:rPr>
+          <w:rFonts w:ascii="Segoe UI Symbol" w:hAnsi="Segoe UI Symbol" w:cs="Segoe UI Symbol"/>
+        </w:rPr>
+        <w:t xml:space="preserve"> </w:t>
+      </w:r>
+      <w:r>
+        <w:rPr>
+          <w:rFonts w:ascii="Segoe UI Symbol" w:hAnsi="Segoe UI Symbol" w:cs="Segoe UI Symbol"/>
+          <w:highlight w:val="yellow"/>
+        </w:rPr>
+        <w:t>Paul</w:t>
+      </w:r>
+    </w:p>
+    <w:p>
+      <w:pPr>
+        <w:pStyle w:val="Web"/>
         <w:numPr>
           <w:ilvl w:val="0"/>
           <w:numId w:val="7"/>
         </w:numPr>
         <w:jc w:val="both"/>
+        <w:rPr>
+          <w:highlight w:val="yellow"/>
+        </w:rPr>
       </w:pPr>
       <w:r>
         <w:t>Enforce policy settings (e.g., max active bookings per patient)</w:t>
@@ -1589,13 +1632,26 @@
           <w:rFonts w:ascii="Segoe UI Symbol" w:hAnsi="Segoe UI Symbol" w:cs="Segoe UI Symbol"/>
         </w:rPr>
         <w:t>☐</w:t>
+      </w:r>
+      <w:r>
+        <w:rPr>
+          <w:rFonts w:ascii="Segoe UI Symbol" w:hAnsi="Segoe UI Symbol" w:cs="Segoe UI Symbol"/>
+        </w:rPr>
+        <w:t xml:space="preserve"> </w:t>
+      </w:r>
+      <w:r>
+        <w:rPr>
+          <w:rFonts w:ascii="Segoe UI Symbol" w:hAnsi="Segoe UI Symbol" w:cs="Segoe UI Symbol"/>
+          <w:highlight w:val="yellow"/>
+        </w:rPr>
+        <w:t>Paul</w:t>
       </w:r>
     </w:p>
     <w:bookmarkEnd w:id="4"/>
     <w:bookmarkEnd w:id="5"/>
     <w:p>
       <w:pPr>
-        <w:pStyle w:val="Heading1"/>
+        <w:pStyle w:val="1"/>
         <w:jc w:val="both"/>
         <w:rPr>
           <w:lang w:val="it-IT"/>
@@ -1662,7 +1718,7 @@
     </w:p>
     <w:p>
       <w:pPr>
-        <w:pStyle w:val="ListParagraph"/>
+        <w:pStyle w:val="af0"/>
         <w:numPr>
           <w:ilvl w:val="0"/>
           <w:numId w:val="9"/>
@@ -1681,7 +1737,7 @@
     </w:p>
     <w:p>
       <w:pPr>
-        <w:pStyle w:val="ListParagraph"/>
+        <w:pStyle w:val="af0"/>
         <w:numPr>
           <w:ilvl w:val="0"/>
           <w:numId w:val="10"/>
@@ -1711,7 +1767,7 @@
     </w:p>
     <w:p>
       <w:pPr>
-        <w:pStyle w:val="ListParagraph"/>
+        <w:pStyle w:val="af0"/>
         <w:numPr>
           <w:ilvl w:val="0"/>
           <w:numId w:val="10"/>
@@ -1741,7 +1797,7 @@
     </w:p>
     <w:p>
       <w:pPr>
-        <w:pStyle w:val="ListParagraph"/>
+        <w:pStyle w:val="af0"/>
         <w:ind w:left="360"/>
         <w:jc w:val="both"/>
         <w:rPr>
@@ -1751,7 +1807,7 @@
     </w:p>
     <w:p>
       <w:pPr>
-        <w:pStyle w:val="ListParagraph"/>
+        <w:pStyle w:val="af0"/>
         <w:numPr>
           <w:ilvl w:val="0"/>
           <w:numId w:val="9"/>
@@ -1770,7 +1826,7 @@
     </w:p>
     <w:p>
       <w:pPr>
-        <w:pStyle w:val="ListParagraph"/>
+        <w:pStyle w:val="af0"/>
         <w:numPr>
           <w:ilvl w:val="0"/>
           <w:numId w:val="11"/>
@@ -1800,7 +1856,7 @@
     </w:p>
     <w:p>
       <w:pPr>
-        <w:pStyle w:val="ListParagraph"/>
+        <w:pStyle w:val="af0"/>
         <w:numPr>
           <w:ilvl w:val="0"/>
           <w:numId w:val="11"/>
@@ -1823,19 +1879,12 @@
           <w:rFonts w:ascii="Segoe UI Symbol" w:eastAsia="新細明體" w:hAnsi="Segoe UI Symbol" w:cs="Segoe UI Symbol"/>
           <w:color w:val="EE0000"/>
         </w:rPr>
-        <w:t xml:space="preserve"> </w:t>
-      </w:r>
-      <w:r>
-        <w:rPr>
-          <w:rFonts w:ascii="Segoe UI Symbol" w:eastAsia="新細明體" w:hAnsi="Segoe UI Symbol" w:cs="Segoe UI Symbol"/>
-          <w:color w:val="EE0000"/>
-        </w:rPr>
-        <w:t>☑</w:t>
-      </w:r>
-    </w:p>
-    <w:p>
-      <w:pPr>
-        <w:pStyle w:val="ListParagraph"/>
+        <w:t xml:space="preserve"> ☑</w:t>
+      </w:r>
+    </w:p>
+    <w:p>
+      <w:pPr>
+        <w:pStyle w:val="af0"/>
         <w:numPr>
           <w:ilvl w:val="0"/>
           <w:numId w:val="11"/>
@@ -1865,7 +1914,7 @@
     </w:p>
     <w:p>
       <w:pPr>
-        <w:pStyle w:val="ListParagraph"/>
+        <w:pStyle w:val="af0"/>
         <w:ind w:left="360"/>
         <w:jc w:val="both"/>
         <w:rPr>
@@ -1875,7 +1924,7 @@
     </w:p>
     <w:p>
       <w:pPr>
-        <w:pStyle w:val="ListParagraph"/>
+        <w:pStyle w:val="af0"/>
         <w:numPr>
           <w:ilvl w:val="0"/>
           <w:numId w:val="9"/>
@@ -1894,7 +1943,7 @@
     </w:p>
     <w:p>
       <w:pPr>
-        <w:pStyle w:val="ListParagraph"/>
+        <w:pStyle w:val="af0"/>
         <w:numPr>
           <w:ilvl w:val="0"/>
           <w:numId w:val="11"/>
@@ -1924,7 +1973,7 @@
     </w:p>
     <w:p>
       <w:pPr>
-        <w:pStyle w:val="ListParagraph"/>
+        <w:pStyle w:val="af0"/>
         <w:numPr>
           <w:ilvl w:val="0"/>
           <w:numId w:val="11"/>
@@ -1954,7 +2003,7 @@
     </w:p>
     <w:p>
       <w:pPr>
-        <w:pStyle w:val="ListParagraph"/>
+        <w:pStyle w:val="af0"/>
         <w:numPr>
           <w:ilvl w:val="0"/>
           <w:numId w:val="11"/>
@@ -1973,7 +2022,7 @@
     </w:p>
     <w:p>
       <w:pPr>
-        <w:pStyle w:val="ListParagraph"/>
+        <w:pStyle w:val="af0"/>
         <w:ind w:left="360"/>
         <w:jc w:val="both"/>
         <w:rPr>
@@ -1983,7 +2032,7 @@
     </w:p>
     <w:p>
       <w:pPr>
-        <w:pStyle w:val="ListParagraph"/>
+        <w:pStyle w:val="af0"/>
         <w:numPr>
           <w:ilvl w:val="0"/>
           <w:numId w:val="9"/>
@@ -2002,7 +2051,7 @@
     </w:p>
     <w:p>
       <w:pPr>
-        <w:pStyle w:val="ListParagraph"/>
+        <w:pStyle w:val="af0"/>
         <w:numPr>
           <w:ilvl w:val="0"/>
           <w:numId w:val="12"/>
@@ -2021,7 +2070,7 @@
     </w:p>
     <w:p>
       <w:pPr>
-        <w:pStyle w:val="ListParagraph"/>
+        <w:pStyle w:val="af0"/>
         <w:numPr>
           <w:ilvl w:val="0"/>
           <w:numId w:val="12"/>
@@ -2106,7 +2155,7 @@
     </w:p>
     <w:p>
       <w:pPr>
-        <w:pStyle w:val="ListParagraph"/>
+        <w:pStyle w:val="af0"/>
         <w:numPr>
           <w:ilvl w:val="0"/>
           <w:numId w:val="13"/>
@@ -2125,7 +2174,7 @@
     </w:p>
     <w:p>
       <w:pPr>
-        <w:pStyle w:val="ListParagraph"/>
+        <w:pStyle w:val="af0"/>
         <w:numPr>
           <w:ilvl w:val="0"/>
           <w:numId w:val="14"/>
@@ -2155,13 +2204,14 @@
     </w:p>
     <w:p>
       <w:pPr>
-        <w:pStyle w:val="ListParagraph"/>
+        <w:pStyle w:val="af0"/>
         <w:numPr>
           <w:ilvl w:val="0"/>
           <w:numId w:val="14"/>
         </w:numPr>
         <w:jc w:val="both"/>
         <w:rPr>
+          <w:highlight w:val="yellow"/>
           <w:lang w:eastAsia="zh-TW"/>
         </w:rPr>
       </w:pPr>
@@ -2193,10 +2243,23 @@
         </w:rPr>
         <w:t>and estimated waiting time (simple estimate acceptable)</w:t>
       </w:r>
-    </w:p>
-    <w:p>
-      <w:pPr>
-        <w:pStyle w:val="ListParagraph"/>
+      <w:r>
+        <w:rPr>
+          <w:lang w:eastAsia="zh-TW"/>
+        </w:rPr>
+        <w:t xml:space="preserve"> </w:t>
+      </w:r>
+      <w:r>
+        <w:rPr>
+          <w:highlight w:val="yellow"/>
+          <w:lang w:eastAsia="zh-TW"/>
+        </w:rPr>
+        <w:t>Slt8ky</w:t>
+      </w:r>
+    </w:p>
+    <w:p>
+      <w:pPr>
+        <w:pStyle w:val="af0"/>
         <w:ind w:left="360"/>
         <w:jc w:val="both"/>
         <w:rPr>
@@ -2206,7 +2269,7 @@
     </w:p>
     <w:p>
       <w:pPr>
-        <w:pStyle w:val="ListParagraph"/>
+        <w:pStyle w:val="af0"/>
         <w:numPr>
           <w:ilvl w:val="0"/>
           <w:numId w:val="13"/>
@@ -2226,7 +2289,7 @@
     </w:p>
     <w:p>
       <w:pPr>
-        <w:pStyle w:val="ListParagraph"/>
+        <w:pStyle w:val="af0"/>
         <w:ind w:left="360"/>
         <w:jc w:val="both"/>
         <w:rPr>
@@ -2236,13 +2299,14 @@
     </w:p>
     <w:p>
       <w:pPr>
-        <w:pStyle w:val="ListParagraph"/>
+        <w:pStyle w:val="af0"/>
         <w:numPr>
           <w:ilvl w:val="0"/>
           <w:numId w:val="15"/>
         </w:numPr>
         <w:jc w:val="both"/>
         <w:rPr>
+          <w:highlight w:val="yellow"/>
           <w:lang w:eastAsia="zh-TW"/>
         </w:rPr>
       </w:pPr>
@@ -2259,10 +2323,23 @@
         </w:rPr>
         <w:t xml:space="preserve"> </w:t>
       </w:r>
-    </w:p>
-    <w:p>
-      <w:pPr>
-        <w:pStyle w:val="ListParagraph"/>
+      <w:r>
+        <w:rPr>
+          <w:lang w:eastAsia="zh-TW"/>
+        </w:rPr>
+        <w:t xml:space="preserve"> </w:t>
+      </w:r>
+      <w:r>
+        <w:rPr>
+          <w:highlight w:val="yellow"/>
+          <w:lang w:eastAsia="zh-TW"/>
+        </w:rPr>
+        <w:t>Slt8ky</w:t>
+      </w:r>
+    </w:p>
+    <w:p>
+      <w:pPr>
+        <w:pStyle w:val="af0"/>
         <w:numPr>
           <w:ilvl w:val="0"/>
           <w:numId w:val="15"/>
@@ -2281,7 +2358,7 @@
     </w:p>
     <w:p>
       <w:pPr>
-        <w:pStyle w:val="ListParagraph"/>
+        <w:pStyle w:val="af0"/>
         <w:ind w:left="360"/>
         <w:jc w:val="both"/>
         <w:rPr>
@@ -2291,7 +2368,7 @@
     </w:p>
     <w:p>
       <w:pPr>
-        <w:pStyle w:val="ListParagraph"/>
+        <w:pStyle w:val="af0"/>
         <w:numPr>
           <w:ilvl w:val="0"/>
           <w:numId w:val="13"/>
@@ -2310,7 +2387,7 @@
     </w:p>
     <w:p>
       <w:pPr>
-        <w:pStyle w:val="ListParagraph"/>
+        <w:pStyle w:val="af0"/>
         <w:numPr>
           <w:ilvl w:val="0"/>
           <w:numId w:val="17"/>
@@ -2411,7 +2488,7 @@
     </w:p>
     <w:p>
       <w:pPr>
-        <w:pStyle w:val="ListParagraph"/>
+        <w:pStyle w:val="af0"/>
         <w:numPr>
           <w:ilvl w:val="0"/>
           <w:numId w:val="16"/>
@@ -2430,7 +2507,7 @@
     </w:p>
     <w:p>
       <w:pPr>
-        <w:pStyle w:val="ListParagraph"/>
+        <w:pStyle w:val="af0"/>
         <w:numPr>
           <w:ilvl w:val="0"/>
           <w:numId w:val="18"/>
@@ -2460,7 +2537,7 @@
     </w:p>
     <w:p>
       <w:pPr>
-        <w:pStyle w:val="ListParagraph"/>
+        <w:pStyle w:val="af0"/>
         <w:numPr>
           <w:ilvl w:val="0"/>
           <w:numId w:val="18"/>
@@ -2496,7 +2573,7 @@
     </w:p>
     <w:p>
       <w:pPr>
-        <w:pStyle w:val="ListParagraph"/>
+        <w:pStyle w:val="af0"/>
         <w:numPr>
           <w:ilvl w:val="0"/>
           <w:numId w:val="18"/>
@@ -2515,7 +2592,7 @@
     </w:p>
     <w:p>
       <w:pPr>
-        <w:pStyle w:val="ListParagraph"/>
+        <w:pStyle w:val="af0"/>
         <w:numPr>
           <w:ilvl w:val="0"/>
           <w:numId w:val="18"/>
@@ -2530,6 +2607,12 @@
           <w:lang w:eastAsia="zh-TW"/>
         </w:rPr>
         <w:t>Queue called, skipped, or expired (any relevant set)</w:t>
+      </w:r>
+      <w:r>
+        <w:rPr>
+          <w:lang w:eastAsia="zh-TW"/>
+        </w:rPr>
+        <w:t xml:space="preserve"> </w:t>
       </w:r>
     </w:p>
     <w:p>
@@ -2597,13 +2680,14 @@
     </w:p>
     <w:p>
       <w:pPr>
-        <w:pStyle w:val="ListParagraph"/>
+        <w:pStyle w:val="af0"/>
         <w:numPr>
           <w:ilvl w:val="0"/>
           <w:numId w:val="19"/>
         </w:numPr>
         <w:jc w:val="both"/>
         <w:rPr>
+          <w:highlight w:val="yellow"/>
           <w:lang w:eastAsia="zh-TW"/>
         </w:rPr>
       </w:pPr>
@@ -2613,10 +2697,23 @@
         </w:rPr>
         <w:t>View appointment records with filters</w:t>
       </w:r>
-    </w:p>
-    <w:p>
-      <w:pPr>
-        <w:pStyle w:val="ListParagraph"/>
+      <w:r>
+        <w:rPr>
+          <w:lang w:eastAsia="zh-TW"/>
+        </w:rPr>
+        <w:t xml:space="preserve"> </w:t>
+      </w:r>
+      <w:r>
+        <w:rPr>
+          <w:highlight w:val="yellow"/>
+          <w:lang w:eastAsia="zh-TW"/>
+        </w:rPr>
+        <w:t>Paul</w:t>
+      </w:r>
+    </w:p>
+    <w:p>
+      <w:pPr>
+        <w:pStyle w:val="af0"/>
         <w:numPr>
           <w:ilvl w:val="0"/>
           <w:numId w:val="20"/>
@@ -2626,11 +2723,19 @@
           <w:lang w:eastAsia="zh-TW"/>
         </w:rPr>
       </w:pPr>
-      <w:r>
-        <w:rPr>
-          <w:lang w:eastAsia="zh-TW"/>
-        </w:rPr>
-        <w:t xml:space="preserve">e.g. </w:t>
+      <w:proofErr w:type="gramStart"/>
+      <w:r>
+        <w:rPr>
+          <w:lang w:eastAsia="zh-TW"/>
+        </w:rPr>
+        <w:t>e.g.</w:t>
+      </w:r>
+      <w:proofErr w:type="gramEnd"/>
+      <w:r>
+        <w:rPr>
+          <w:lang w:eastAsia="zh-TW"/>
+        </w:rPr>
+        <w:t xml:space="preserve"> </w:t>
       </w:r>
       <w:r>
         <w:rPr>
@@ -2649,13 +2754,14 @@
     </w:p>
     <w:p>
       <w:pPr>
-        <w:pStyle w:val="ListParagraph"/>
+        <w:pStyle w:val="af0"/>
         <w:numPr>
           <w:ilvl w:val="0"/>
           <w:numId w:val="19"/>
         </w:numPr>
         <w:jc w:val="both"/>
         <w:rPr>
+          <w:highlight w:val="yellow"/>
           <w:lang w:eastAsia="zh-TW"/>
         </w:rPr>
       </w:pPr>
@@ -2665,10 +2771,23 @@
         </w:rPr>
         <w:t>Utilisation Rate</w:t>
       </w:r>
-    </w:p>
-    <w:p>
-      <w:pPr>
-        <w:pStyle w:val="ListParagraph"/>
+      <w:r>
+        <w:rPr>
+          <w:lang w:eastAsia="zh-TW"/>
+        </w:rPr>
+        <w:t xml:space="preserve"> </w:t>
+      </w:r>
+      <w:r>
+        <w:rPr>
+          <w:highlight w:val="yellow"/>
+          <w:lang w:eastAsia="zh-TW"/>
+        </w:rPr>
+        <w:t>Slt8ky</w:t>
+      </w:r>
+    </w:p>
+    <w:p>
+      <w:pPr>
+        <w:pStyle w:val="af0"/>
         <w:numPr>
           <w:ilvl w:val="0"/>
           <w:numId w:val="20"/>
@@ -2687,7 +2806,7 @@
     </w:p>
     <w:p>
       <w:pPr>
-        <w:pStyle w:val="ListParagraph"/>
+        <w:pStyle w:val="af0"/>
         <w:numPr>
           <w:ilvl w:val="0"/>
           <w:numId w:val="20"/>
@@ -2714,13 +2833,14 @@
     </w:p>
     <w:p>
       <w:pPr>
-        <w:pStyle w:val="ListParagraph"/>
+        <w:pStyle w:val="af0"/>
         <w:numPr>
           <w:ilvl w:val="0"/>
           <w:numId w:val="19"/>
         </w:numPr>
         <w:jc w:val="both"/>
         <w:rPr>
+          <w:highlight w:val="yellow"/>
           <w:lang w:eastAsia="zh-TW"/>
         </w:rPr>
       </w:pPr>
@@ -2730,10 +2850,23 @@
         </w:rPr>
         <w:t>No-show Summary</w:t>
       </w:r>
-    </w:p>
-    <w:p>
-      <w:pPr>
-        <w:pStyle w:val="ListParagraph"/>
+      <w:r>
+        <w:rPr>
+          <w:lang w:eastAsia="zh-TW"/>
+        </w:rPr>
+        <w:t xml:space="preserve"> </w:t>
+      </w:r>
+      <w:r>
+        <w:rPr>
+          <w:highlight w:val="yellow"/>
+          <w:lang w:eastAsia="zh-TW"/>
+        </w:rPr>
+        <w:t>Slt8ky</w:t>
+      </w:r>
+    </w:p>
+    <w:p>
+      <w:pPr>
+        <w:pStyle w:val="af0"/>
         <w:numPr>
           <w:ilvl w:val="0"/>
           <w:numId w:val="17"/>
@@ -2752,7 +2885,7 @@
     </w:p>
     <w:p>
       <w:pPr>
-        <w:pStyle w:val="ListParagraph"/>
+        <w:pStyle w:val="af0"/>
         <w:numPr>
           <w:ilvl w:val="0"/>
           <w:numId w:val="17"/>
@@ -2837,7 +2970,7 @@
     </w:p>
     <w:p>
       <w:pPr>
-        <w:pStyle w:val="ListParagraph"/>
+        <w:pStyle w:val="af0"/>
         <w:numPr>
           <w:ilvl w:val="0"/>
           <w:numId w:val="22"/>
@@ -2858,7 +2991,7 @@
     </w:p>
     <w:p>
       <w:pPr>
-        <w:pStyle w:val="ListParagraph"/>
+        <w:pStyle w:val="af0"/>
         <w:numPr>
           <w:ilvl w:val="0"/>
           <w:numId w:val="21"/>
@@ -2896,7 +3029,7 @@
     </w:p>
     <w:p>
       <w:pPr>
-        <w:pStyle w:val="ListParagraph"/>
+        <w:pStyle w:val="af0"/>
         <w:numPr>
           <w:ilvl w:val="0"/>
           <w:numId w:val="21"/>
@@ -2934,7 +3067,7 @@
     </w:p>
     <w:p>
       <w:pPr>
-        <w:pStyle w:val="ListParagraph"/>
+        <w:pStyle w:val="af0"/>
         <w:numPr>
           <w:ilvl w:val="0"/>
           <w:numId w:val="21"/>
@@ -2980,7 +3113,7 @@
     </w:p>
     <w:p>
       <w:pPr>
-        <w:pStyle w:val="ListParagraph"/>
+        <w:pStyle w:val="af0"/>
         <w:numPr>
           <w:ilvl w:val="0"/>
           <w:numId w:val="22"/>
@@ -3001,7 +3134,7 @@
     </w:p>
     <w:p>
       <w:pPr>
-        <w:pStyle w:val="ListParagraph"/>
+        <w:pStyle w:val="af0"/>
         <w:numPr>
           <w:ilvl w:val="0"/>
           <w:numId w:val="23"/>
@@ -3039,7 +3172,7 @@
     </w:p>
     <w:p>
       <w:pPr>
-        <w:pStyle w:val="ListParagraph"/>
+        <w:pStyle w:val="af0"/>
         <w:numPr>
           <w:ilvl w:val="0"/>
           <w:numId w:val="22"/>
@@ -3058,7 +3191,7 @@
     </w:p>
     <w:p>
       <w:pPr>
-        <w:pStyle w:val="ListParagraph"/>
+        <w:pStyle w:val="af0"/>
         <w:numPr>
           <w:ilvl w:val="0"/>
           <w:numId w:val="23"/>
@@ -3077,7 +3210,7 @@
     </w:p>
     <w:p>
       <w:pPr>
-        <w:pStyle w:val="ListParagraph"/>
+        <w:pStyle w:val="af0"/>
         <w:numPr>
           <w:ilvl w:val="0"/>
           <w:numId w:val="23"/>
@@ -3173,7 +3306,7 @@
     </w:p>
     <w:p>
       <w:pPr>
-        <w:pStyle w:val="ListParagraph"/>
+        <w:pStyle w:val="af0"/>
         <w:numPr>
           <w:ilvl w:val="0"/>
           <w:numId w:val="23"/>
@@ -3192,7 +3325,7 @@
     </w:p>
     <w:p>
       <w:pPr>
-        <w:pStyle w:val="ListParagraph"/>
+        <w:pStyle w:val="af0"/>
         <w:numPr>
           <w:ilvl w:val="0"/>
           <w:numId w:val="23"/>
@@ -3211,7 +3344,7 @@
     </w:p>
     <w:p>
       <w:pPr>
-        <w:pStyle w:val="ListParagraph"/>
+        <w:pStyle w:val="af0"/>
         <w:numPr>
           <w:ilvl w:val="0"/>
           <w:numId w:val="23"/>
@@ -3231,7 +3364,7 @@
     </w:p>
     <w:p>
       <w:pPr>
-        <w:pStyle w:val="ListParagraph"/>
+        <w:pStyle w:val="af0"/>
         <w:numPr>
           <w:ilvl w:val="0"/>
           <w:numId w:val="23"/>
@@ -3250,7 +3383,7 @@
     </w:p>
     <w:p>
       <w:pPr>
-        <w:pStyle w:val="ListParagraph"/>
+        <w:pStyle w:val="af0"/>
         <w:numPr>
           <w:ilvl w:val="0"/>
           <w:numId w:val="23"/>
@@ -3293,7 +3426,7 @@
     </w:p>
     <w:p>
       <w:pPr>
-        <w:pStyle w:val="Heading1"/>
+        <w:pStyle w:val="1"/>
         <w:jc w:val="both"/>
       </w:pPr>
       <w:bookmarkStart w:id="7" w:name="OLE_LINK4"/>
@@ -3314,7 +3447,7 @@
     </w:p>
     <w:tbl>
       <w:tblPr>
-        <w:tblStyle w:val="TableGrid"/>
+        <w:tblStyle w:val="af1"/>
         <w:tblW w:w="0" w:type="auto"/>
         <w:tblLook w:val="04A0" w:firstRow="1" w:lastRow="0" w:firstColumn="1" w:lastColumn="0" w:noHBand="0" w:noVBand="1"/>
       </w:tblPr>
@@ -4720,21 +4853,7 @@
         <w:rPr>
           <w:rFonts w:ascii="Times New Roman" w:hAnsi="Times New Roman"/>
         </w:rPr>
-        <w:t xml:space="preserve">Use JSP/servlets to accept user </w:t>
-      </w:r>
-      <w:proofErr w:type="gramStart"/>
-      <w:r>
-        <w:rPr>
-          <w:rFonts w:ascii="Times New Roman" w:hAnsi="Times New Roman"/>
-        </w:rPr>
-        <w:t>inputs</w:t>
-      </w:r>
-      <w:proofErr w:type="gramEnd"/>
-      <w:r>
-        <w:rPr>
-          <w:rFonts w:ascii="Times New Roman" w:hAnsi="Times New Roman"/>
-        </w:rPr>
-        <w:t xml:space="preserve"> from browser</w:t>
+        <w:t>Use JSP/servlets to accept user inputs from browser</w:t>
       </w:r>
     </w:p>
     <w:p>
@@ -4785,7 +4904,6 @@
         </w:rPr>
         <w:t xml:space="preserve"> (</w:t>
       </w:r>
-      <w:proofErr w:type="spellStart"/>
       <w:r>
         <w:rPr>
           <w:rFonts w:ascii="Times New Roman" w:hAnsi="Times New Roman"/>
@@ -4796,14 +4914,7 @@
         <w:rPr>
           <w:rFonts w:ascii="Times New Roman" w:hAnsi="Times New Roman"/>
         </w:rPr>
-        <w:t>aglib</w:t>
-      </w:r>
-      <w:proofErr w:type="spellEnd"/>
-      <w:r>
-        <w:rPr>
-          <w:rFonts w:ascii="Times New Roman" w:hAnsi="Times New Roman"/>
-        </w:rPr>
-        <w:t>).</w:t>
+        <w:t>aglib).</w:t>
       </w:r>
     </w:p>
     <w:p>
@@ -5125,7 +5236,7 @@
     </w:p>
     <w:p>
       <w:pPr>
-        <w:pStyle w:val="Heading1"/>
+        <w:pStyle w:val="1"/>
         <w:jc w:val="both"/>
       </w:pPr>
       <w:r>
@@ -5148,7 +5259,7 @@
     </w:p>
     <w:tbl>
       <w:tblPr>
-        <w:tblStyle w:val="TableGrid"/>
+        <w:tblStyle w:val="af1"/>
         <w:tblW w:w="0" w:type="auto"/>
         <w:tblLook w:val="04A0" w:firstRow="1" w:lastRow="0" w:firstColumn="1" w:lastColumn="0" w:noHBand="0" w:noVBand="1"/>
       </w:tblPr>
@@ -5345,7 +5456,7 @@
           </w:tcPr>
           <w:p>
             <w:pPr>
-              <w:pStyle w:val="ListParagraph"/>
+              <w:pStyle w:val="af0"/>
               <w:numPr>
                 <w:ilvl w:val="0"/>
                 <w:numId w:val="22"/>
@@ -5413,7 +5524,7 @@
     </w:tbl>
     <w:p>
       <w:pPr>
-        <w:pStyle w:val="Heading1"/>
+        <w:pStyle w:val="1"/>
         <w:jc w:val="both"/>
         <w:rPr>
           <w:lang w:val="nl-NL"/>
@@ -5439,7 +5550,7 @@
     </w:p>
     <w:p>
       <w:pPr>
-        <w:pStyle w:val="Heading1"/>
+        <w:pStyle w:val="1"/>
         <w:jc w:val="both"/>
         <w:rPr>
           <w:lang w:val="nl-NL"/>
@@ -6102,7 +6213,7 @@
 </file>
 
 <file path=word/endnotes.xml><?xml version="1.0" encoding="utf-8"?>
-<w:endnotes xmlns:wpc="http://schemas.microsoft.com/office/word/2010/wordprocessingCanvas" xmlns:cx="http://schemas.microsoft.com/office/drawing/2014/chartex" xmlns:cx1="http://schemas.microsoft.com/office/drawing/2015/9/8/chartex" xmlns:cx2="http://schemas.microsoft.com/office/drawing/2015/10/21/chartex" xmlns:cx3="http://schemas.microsoft.com/office/drawing/2016/5/9/chartex" xmlns:cx4="http://schemas.microsoft.com/office/drawing/2016/5/10/chartex" xmlns:cx5="http://schemas.microsoft.com/office/drawing/2016/5/11/chartex" xmlns:cx6="http://schemas.microsoft.com/office/drawing/2016/5/12/chartex" xmlns:cx7="http://schemas.microsoft.com/office/drawing/2016/5/13/chartex" xmlns:cx8="http://schemas.microsoft.com/office/drawing/2016/5/14/chartex" xmlns:mc="http://schemas.openxmlformats.org/markup-compatibility/2006" xmlns:aink="http://schemas.microsoft.com/office/drawing/2016/ink" xmlns:am3d="http://schemas.microsoft.com/office/drawing/2017/model3d" xmlns:o="urn:schemas-microsoft-com:office:office" xmlns:oel="http://schemas.microsoft.com/office/2019/extlst" xmlns:r="http://schemas.openxmlformats.org/officeDocument/2006/relationships" xmlns:m="http://schemas.openxmlformats.org/officeDocument/2006/math" xmlns:v="urn:schemas-microsoft-com:vml" xmlns:wp14="http://schemas.microsoft.com/office/word/2010/wordprocessingDrawing" xmlns:wp="http://schemas.openxmlformats.org/drawingml/2006/wordprocessingDrawing" xmlns:w10="urn:schemas-microsoft-com:office:word" xmlns:w="http://schemas.openxmlformats.org/wordprocessingml/2006/main" xmlns:w14="http://schemas.microsoft.com/office/word/2010/wordml" xmlns:w15="http://schemas.microsoft.com/office/word/2012/wordml" xmlns:w16cex="http://schemas.microsoft.com/office/word/2018/wordml/cex" xmlns:w16cid="http://schemas.microsoft.com/office/word/2016/wordml/cid" xmlns:w16="http://schemas.microsoft.com/office/word/2018/wordml" xmlns:w16du="http://schemas.microsoft.com/office/word/2023/wordml/word16du" xmlns:w16sdtdh="http://schemas.microsoft.com/office/word/2020/wordml/sdtdatahash" xmlns:w16sdtfl="http://schemas.microsoft.com/office/word/2024/wordml/sdtformatlock" xmlns:w16se="http://schemas.microsoft.com/office/word/2015/wordml/symex" xmlns:wpg="http://schemas.microsoft.com/office/word/2010/wordprocessingGroup" xmlns:wpi="http://schemas.microsoft.com/office/word/2010/wordprocessingInk" xmlns:wne="http://schemas.microsoft.com/office/word/2006/wordml" xmlns:wps="http://schemas.microsoft.com/office/word/2010/wordprocessingShape" mc:Ignorable="w14 w15 w16se w16cid w16 w16cex w16sdtdh w16sdtfl w16du wp14">
+<w:endnotes xmlns:wpc="http://schemas.microsoft.com/office/word/2010/wordprocessingCanvas" xmlns:cx="http://schemas.microsoft.com/office/drawing/2014/chartex" xmlns:cx1="http://schemas.microsoft.com/office/drawing/2015/9/8/chartex" xmlns:cx2="http://schemas.microsoft.com/office/drawing/2015/10/21/chartex" xmlns:cx3="http://schemas.microsoft.com/office/drawing/2016/5/9/chartex" xmlns:cx4="http://schemas.microsoft.com/office/drawing/2016/5/10/chartex" xmlns:cx5="http://schemas.microsoft.com/office/drawing/2016/5/11/chartex" xmlns:cx6="http://schemas.microsoft.com/office/drawing/2016/5/12/chartex" xmlns:cx7="http://schemas.microsoft.com/office/drawing/2016/5/13/chartex" xmlns:cx8="http://schemas.microsoft.com/office/drawing/2016/5/14/chartex" xmlns:mc="http://schemas.openxmlformats.org/markup-compatibility/2006" xmlns:aink="http://schemas.microsoft.com/office/drawing/2016/ink" xmlns:am3d="http://schemas.microsoft.com/office/drawing/2017/model3d" xmlns:o="urn:schemas-microsoft-com:office:office" xmlns:r="http://schemas.openxmlformats.org/officeDocument/2006/relationships" xmlns:m="http://schemas.openxmlformats.org/officeDocument/2006/math" xmlns:v="urn:schemas-microsoft-com:vml" xmlns:wp14="http://schemas.microsoft.com/office/word/2010/wordprocessingDrawing" xmlns:wp="http://schemas.openxmlformats.org/drawingml/2006/wordprocessingDrawing" xmlns:w10="urn:schemas-microsoft-com:office:word" xmlns:w="http://schemas.openxmlformats.org/wordprocessingml/2006/main" xmlns:w14="http://schemas.microsoft.com/office/word/2010/wordml" xmlns:w15="http://schemas.microsoft.com/office/word/2012/wordml" xmlns:w16cex="http://schemas.microsoft.com/office/word/2018/wordml/cex" xmlns:w16cid="http://schemas.microsoft.com/office/word/2016/wordml/cid" xmlns:w16="http://schemas.microsoft.com/office/word/2018/wordml" xmlns:w16sdtdh="http://schemas.microsoft.com/office/word/2020/wordml/sdtdatahash" xmlns:w16se="http://schemas.microsoft.com/office/word/2015/wordml/symex" xmlns:wpg="http://schemas.microsoft.com/office/word/2010/wordprocessingGroup" xmlns:wpi="http://schemas.microsoft.com/office/word/2010/wordprocessingInk" xmlns:wne="http://schemas.microsoft.com/office/word/2006/wordml" xmlns:wps="http://schemas.microsoft.com/office/word/2010/wordprocessingShape" mc:Ignorable="w14 w15 w16se w16cid w16 w16cex w16sdtdh wp14">
   <w:endnote w:type="separator" w:id="-1">
     <w:p>
       <w:r>
@@ -6121,11 +6232,11 @@
 </file>
 
 <file path=word/footer1.xml><?xml version="1.0" encoding="utf-8"?>
-<w:ftr xmlns:wpc="http://schemas.microsoft.com/office/word/2010/wordprocessingCanvas" xmlns:cx="http://schemas.microsoft.com/office/drawing/2014/chartex" xmlns:cx1="http://schemas.microsoft.com/office/drawing/2015/9/8/chartex" xmlns:cx2="http://schemas.microsoft.com/office/drawing/2015/10/21/chartex" xmlns:cx3="http://schemas.microsoft.com/office/drawing/2016/5/9/chartex" xmlns:cx4="http://schemas.microsoft.com/office/drawing/2016/5/10/chartex" xmlns:cx5="http://schemas.microsoft.com/office/drawing/2016/5/11/chartex" xmlns:cx6="http://schemas.microsoft.com/office/drawing/2016/5/12/chartex" xmlns:cx7="http://schemas.microsoft.com/office/drawing/2016/5/13/chartex" xmlns:cx8="http://schemas.microsoft.com/office/drawing/2016/5/14/chartex" xmlns:mc="http://schemas.openxmlformats.org/markup-compatibility/2006" xmlns:aink="http://schemas.microsoft.com/office/drawing/2016/ink" xmlns:am3d="http://schemas.microsoft.com/office/drawing/2017/model3d" xmlns:o="urn:schemas-microsoft-com:office:office" xmlns:oel="http://schemas.microsoft.com/office/2019/extlst" xmlns:r="http://schemas.openxmlformats.org/officeDocument/2006/relationships" xmlns:m="http://schemas.openxmlformats.org/officeDocument/2006/math" xmlns:v="urn:schemas-microsoft-com:vml" xmlns:wp14="http://schemas.microsoft.com/office/word/2010/wordprocessingDrawing" xmlns:wp="http://schemas.openxmlformats.org/drawingml/2006/wordprocessingDrawing" xmlns:w10="urn:schemas-microsoft-com:office:word" xmlns:w="http://schemas.openxmlformats.org/wordprocessingml/2006/main" xmlns:w14="http://schemas.microsoft.com/office/word/2010/wordml" xmlns:w15="http://schemas.microsoft.com/office/word/2012/wordml" xmlns:w16cex="http://schemas.microsoft.com/office/word/2018/wordml/cex" xmlns:w16cid="http://schemas.microsoft.com/office/word/2016/wordml/cid" xmlns:w16="http://schemas.microsoft.com/office/word/2018/wordml" xmlns:w16du="http://schemas.microsoft.com/office/word/2023/wordml/word16du" xmlns:w16sdtdh="http://schemas.microsoft.com/office/word/2020/wordml/sdtdatahash" xmlns:w16sdtfl="http://schemas.microsoft.com/office/word/2024/wordml/sdtformatlock" xmlns:w16se="http://schemas.microsoft.com/office/word/2015/wordml/symex" xmlns:wpg="http://schemas.microsoft.com/office/word/2010/wordprocessingGroup" xmlns:wpi="http://schemas.microsoft.com/office/word/2010/wordprocessingInk" xmlns:wne="http://schemas.microsoft.com/office/word/2006/wordml" xmlns:wps="http://schemas.microsoft.com/office/word/2010/wordprocessingShape" mc:Ignorable="w14 w15 w16se w16cid w16 w16cex w16sdtdh w16sdtfl w16du wp14">
+<w:ftr xmlns:wpc="http://schemas.microsoft.com/office/word/2010/wordprocessingCanvas" xmlns:cx="http://schemas.microsoft.com/office/drawing/2014/chartex" xmlns:cx1="http://schemas.microsoft.com/office/drawing/2015/9/8/chartex" xmlns:cx2="http://schemas.microsoft.com/office/drawing/2015/10/21/chartex" xmlns:cx3="http://schemas.microsoft.com/office/drawing/2016/5/9/chartex" xmlns:cx4="http://schemas.microsoft.com/office/drawing/2016/5/10/chartex" xmlns:cx5="http://schemas.microsoft.com/office/drawing/2016/5/11/chartex" xmlns:cx6="http://schemas.microsoft.com/office/drawing/2016/5/12/chartex" xmlns:cx7="http://schemas.microsoft.com/office/drawing/2016/5/13/chartex" xmlns:cx8="http://schemas.microsoft.com/office/drawing/2016/5/14/chartex" xmlns:mc="http://schemas.openxmlformats.org/markup-compatibility/2006" xmlns:aink="http://schemas.microsoft.com/office/drawing/2016/ink" xmlns:am3d="http://schemas.microsoft.com/office/drawing/2017/model3d" xmlns:o="urn:schemas-microsoft-com:office:office" xmlns:r="http://schemas.openxmlformats.org/officeDocument/2006/relationships" xmlns:m="http://schemas.openxmlformats.org/officeDocument/2006/math" xmlns:v="urn:schemas-microsoft-com:vml" xmlns:wp14="http://schemas.microsoft.com/office/word/2010/wordprocessingDrawing" xmlns:wp="http://schemas.openxmlformats.org/drawingml/2006/wordprocessingDrawing" xmlns:w10="urn:schemas-microsoft-com:office:word" xmlns:w="http://schemas.openxmlformats.org/wordprocessingml/2006/main" xmlns:w14="http://schemas.microsoft.com/office/word/2010/wordml" xmlns:w15="http://schemas.microsoft.com/office/word/2012/wordml" xmlns:w16cex="http://schemas.microsoft.com/office/word/2018/wordml/cex" xmlns:w16cid="http://schemas.microsoft.com/office/word/2016/wordml/cid" xmlns:w16="http://schemas.microsoft.com/office/word/2018/wordml" xmlns:w16sdtdh="http://schemas.microsoft.com/office/word/2020/wordml/sdtdatahash" xmlns:w16se="http://schemas.microsoft.com/office/word/2015/wordml/symex" xmlns:wpg="http://schemas.microsoft.com/office/word/2010/wordprocessingGroup" xmlns:wpi="http://schemas.microsoft.com/office/word/2010/wordprocessingInk" xmlns:wne="http://schemas.microsoft.com/office/word/2006/wordml" xmlns:wps="http://schemas.microsoft.com/office/word/2010/wordprocessingShape" mc:Ignorable="w14 w15 w16se w16cid w16 w16cex w16sdtdh wp14">
   <w:sdt>
     <w:sdtPr>
       <w:rPr>
-        <w:rStyle w:val="PageNumber"/>
+        <w:rStyle w:val="a8"/>
       </w:rPr>
       <w:id w:val="1568762926"/>
       <w:docPartObj>
@@ -6133,43 +6244,48 @@
         <w:docPartUnique/>
       </w:docPartObj>
     </w:sdtPr>
+    <w:sdtEndPr>
+      <w:rPr>
+        <w:rStyle w:val="a8"/>
+      </w:rPr>
+    </w:sdtEndPr>
     <w:sdtContent>
       <w:p>
         <w:pPr>
-          <w:pStyle w:val="Footer"/>
+          <w:pStyle w:val="a6"/>
           <w:framePr w:wrap="none" w:vAnchor="text" w:hAnchor="margin" w:xAlign="right" w:y="1"/>
           <w:rPr>
-            <w:rStyle w:val="PageNumber"/>
+            <w:rStyle w:val="a8"/>
           </w:rPr>
         </w:pPr>
         <w:r>
           <w:rPr>
-            <w:rStyle w:val="PageNumber"/>
+            <w:rStyle w:val="a8"/>
           </w:rPr>
           <w:fldChar w:fldCharType="begin"/>
         </w:r>
         <w:r>
           <w:rPr>
-            <w:rStyle w:val="PageNumber"/>
+            <w:rStyle w:val="a8"/>
           </w:rPr>
           <w:instrText xml:space="preserve"> PAGE </w:instrText>
         </w:r>
         <w:r>
           <w:rPr>
-            <w:rStyle w:val="PageNumber"/>
+            <w:rStyle w:val="a8"/>
           </w:rPr>
           <w:fldChar w:fldCharType="separate"/>
         </w:r>
         <w:r>
           <w:rPr>
-            <w:rStyle w:val="PageNumber"/>
+            <w:rStyle w:val="a8"/>
             <w:noProof/>
           </w:rPr>
           <w:t>4</w:t>
         </w:r>
         <w:r>
           <w:rPr>
-            <w:rStyle w:val="PageNumber"/>
+            <w:rStyle w:val="a8"/>
           </w:rPr>
           <w:fldChar w:fldCharType="end"/>
         </w:r>
@@ -6178,7 +6294,7 @@
   </w:sdt>
   <w:p>
     <w:pPr>
-      <w:pStyle w:val="Footer"/>
+      <w:pStyle w:val="a6"/>
       <w:ind w:right="360"/>
     </w:pPr>
   </w:p>
@@ -6186,11 +6302,11 @@
 </file>
 
 <file path=word/footer2.xml><?xml version="1.0" encoding="utf-8"?>
-<w:ftr xmlns:wpc="http://schemas.microsoft.com/office/word/2010/wordprocessingCanvas" xmlns:cx="http://schemas.microsoft.com/office/drawing/2014/chartex" xmlns:cx1="http://schemas.microsoft.com/office/drawing/2015/9/8/chartex" xmlns:cx2="http://schemas.microsoft.com/office/drawing/2015/10/21/chartex" xmlns:cx3="http://schemas.microsoft.com/office/drawing/2016/5/9/chartex" xmlns:cx4="http://schemas.microsoft.com/office/drawing/2016/5/10/chartex" xmlns:cx5="http://schemas.microsoft.com/office/drawing/2016/5/11/chartex" xmlns:cx6="http://schemas.microsoft.com/office/drawing/2016/5/12/chartex" xmlns:cx7="http://schemas.microsoft.com/office/drawing/2016/5/13/chartex" xmlns:cx8="http://schemas.microsoft.com/office/drawing/2016/5/14/chartex" xmlns:mc="http://schemas.openxmlformats.org/markup-compatibility/2006" xmlns:aink="http://schemas.microsoft.com/office/drawing/2016/ink" xmlns:am3d="http://schemas.microsoft.com/office/drawing/2017/model3d" xmlns:o="urn:schemas-microsoft-com:office:office" xmlns:oel="http://schemas.microsoft.com/office/2019/extlst" xmlns:r="http://schemas.openxmlformats.org/officeDocument/2006/relationships" xmlns:m="http://schemas.openxmlformats.org/officeDocument/2006/math" xmlns:v="urn:schemas-microsoft-com:vml" xmlns:wp14="http://schemas.microsoft.com/office/word/2010/wordprocessingDrawing" xmlns:wp="http://schemas.openxmlformats.org/drawingml/2006/wordprocessingDrawing" xmlns:w10="urn:schemas-microsoft-com:office:word" xmlns:w="http://schemas.openxmlformats.org/wordprocessingml/2006/main" xmlns:w14="http://schemas.microsoft.com/office/word/2010/wordml" xmlns:w15="http://schemas.microsoft.com/office/word/2012/wordml" xmlns:w16cex="http://schemas.microsoft.com/office/word/2018/wordml/cex" xmlns:w16cid="http://schemas.microsoft.com/office/word/2016/wordml/cid" xmlns:w16="http://schemas.microsoft.com/office/word/2018/wordml" xmlns:w16du="http://schemas.microsoft.com/office/word/2023/wordml/word16du" xmlns:w16sdtdh="http://schemas.microsoft.com/office/word/2020/wordml/sdtdatahash" xmlns:w16sdtfl="http://schemas.microsoft.com/office/word/2024/wordml/sdtformatlock" xmlns:w16se="http://schemas.microsoft.com/office/word/2015/wordml/symex" xmlns:wpg="http://schemas.microsoft.com/office/word/2010/wordprocessingGroup" xmlns:wpi="http://schemas.microsoft.com/office/word/2010/wordprocessingInk" xmlns:wne="http://schemas.microsoft.com/office/word/2006/wordml" xmlns:wps="http://schemas.microsoft.com/office/word/2010/wordprocessingShape" mc:Ignorable="w14 w15 w16se w16cid w16 w16cex w16sdtdh w16sdtfl w16du wp14">
+<w:ftr xmlns:wpc="http://schemas.microsoft.com/office/word/2010/wordprocessingCanvas" xmlns:cx="http://schemas.microsoft.com/office/drawing/2014/chartex" xmlns:cx1="http://schemas.microsoft.com/office/drawing/2015/9/8/chartex" xmlns:cx2="http://schemas.microsoft.com/office/drawing/2015/10/21/chartex" xmlns:cx3="http://schemas.microsoft.com/office/drawing/2016/5/9/chartex" xmlns:cx4="http://schemas.microsoft.com/office/drawing/2016/5/10/chartex" xmlns:cx5="http://schemas.microsoft.com/office/drawing/2016/5/11/chartex" xmlns:cx6="http://schemas.microsoft.com/office/drawing/2016/5/12/chartex" xmlns:cx7="http://schemas.microsoft.com/office/drawing/2016/5/13/chartex" xmlns:cx8="http://schemas.microsoft.com/office/drawing/2016/5/14/chartex" xmlns:mc="http://schemas.openxmlformats.org/markup-compatibility/2006" xmlns:aink="http://schemas.microsoft.com/office/drawing/2016/ink" xmlns:am3d="http://schemas.microsoft.com/office/drawing/2017/model3d" xmlns:o="urn:schemas-microsoft-com:office:office" xmlns:r="http://schemas.openxmlformats.org/officeDocument/2006/relationships" xmlns:m="http://schemas.openxmlformats.org/officeDocument/2006/math" xmlns:v="urn:schemas-microsoft-com:vml" xmlns:wp14="http://schemas.microsoft.com/office/word/2010/wordprocessingDrawing" xmlns:wp="http://schemas.openxmlformats.org/drawingml/2006/wordprocessingDrawing" xmlns:w10="urn:schemas-microsoft-com:office:word" xmlns:w="http://schemas.openxmlformats.org/wordprocessingml/2006/main" xmlns:w14="http://schemas.microsoft.com/office/word/2010/wordml" xmlns:w15="http://schemas.microsoft.com/office/word/2012/wordml" xmlns:w16cex="http://schemas.microsoft.com/office/word/2018/wordml/cex" xmlns:w16cid="http://schemas.microsoft.com/office/word/2016/wordml/cid" xmlns:w16="http://schemas.microsoft.com/office/word/2018/wordml" xmlns:w16sdtdh="http://schemas.microsoft.com/office/word/2020/wordml/sdtdatahash" xmlns:w16se="http://schemas.microsoft.com/office/word/2015/wordml/symex" xmlns:wpg="http://schemas.microsoft.com/office/word/2010/wordprocessingGroup" xmlns:wpi="http://schemas.microsoft.com/office/word/2010/wordprocessingInk" xmlns:wne="http://schemas.microsoft.com/office/word/2006/wordml" xmlns:wps="http://schemas.microsoft.com/office/word/2010/wordprocessingShape" mc:Ignorable="w14 w15 w16se w16cid w16 w16cex w16sdtdh wp14">
   <w:sdt>
     <w:sdtPr>
       <w:rPr>
-        <w:rStyle w:val="PageNumber"/>
+        <w:rStyle w:val="a8"/>
         <w:sz w:val="20"/>
         <w:szCs w:val="20"/>
       </w:rPr>
@@ -6200,20 +6316,25 @@
         <w:docPartUnique/>
       </w:docPartObj>
     </w:sdtPr>
+    <w:sdtEndPr>
+      <w:rPr>
+        <w:rStyle w:val="a8"/>
+      </w:rPr>
+    </w:sdtEndPr>
     <w:sdtContent>
       <w:p>
         <w:pPr>
-          <w:pStyle w:val="Footer"/>
+          <w:pStyle w:val="a6"/>
           <w:framePr w:wrap="none" w:vAnchor="text" w:hAnchor="margin" w:xAlign="right" w:y="1"/>
           <w:rPr>
-            <w:rStyle w:val="PageNumber"/>
+            <w:rStyle w:val="a8"/>
             <w:sz w:val="20"/>
             <w:szCs w:val="20"/>
           </w:rPr>
         </w:pPr>
         <w:r>
           <w:rPr>
-            <w:rStyle w:val="PageNumber"/>
+            <w:rStyle w:val="a8"/>
             <w:sz w:val="20"/>
             <w:szCs w:val="20"/>
           </w:rPr>
@@ -6221,7 +6342,7 @@
         </w:r>
         <w:r>
           <w:rPr>
-            <w:rStyle w:val="PageNumber"/>
+            <w:rStyle w:val="a8"/>
             <w:sz w:val="20"/>
             <w:szCs w:val="20"/>
           </w:rPr>
@@ -6229,7 +6350,7 @@
         </w:r>
         <w:r>
           <w:rPr>
-            <w:rStyle w:val="PageNumber"/>
+            <w:rStyle w:val="a8"/>
             <w:sz w:val="20"/>
             <w:szCs w:val="20"/>
           </w:rPr>
@@ -6237,7 +6358,7 @@
         </w:r>
         <w:r>
           <w:rPr>
-            <w:rStyle w:val="PageNumber"/>
+            <w:rStyle w:val="a8"/>
             <w:noProof/>
             <w:sz w:val="20"/>
             <w:szCs w:val="20"/>
@@ -6246,7 +6367,7 @@
         </w:r>
         <w:r>
           <w:rPr>
-            <w:rStyle w:val="PageNumber"/>
+            <w:rStyle w:val="a8"/>
             <w:sz w:val="20"/>
             <w:szCs w:val="20"/>
           </w:rPr>
@@ -6268,7 +6389,7 @@
 </file>
 
 <file path=word/footnotes.xml><?xml version="1.0" encoding="utf-8"?>
-<w:footnotes xmlns:wpc="http://schemas.microsoft.com/office/word/2010/wordprocessingCanvas" xmlns:cx="http://schemas.microsoft.com/office/drawing/2014/chartex" xmlns:cx1="http://schemas.microsoft.com/office/drawing/2015/9/8/chartex" xmlns:cx2="http://schemas.microsoft.com/office/drawing/2015/10/21/chartex" xmlns:cx3="http://schemas.microsoft.com/office/drawing/2016/5/9/chartex" xmlns:cx4="http://schemas.microsoft.com/office/drawing/2016/5/10/chartex" xmlns:cx5="http://schemas.microsoft.com/office/drawing/2016/5/11/chartex" xmlns:cx6="http://schemas.microsoft.com/office/drawing/2016/5/12/chartex" xmlns:cx7="http://schemas.microsoft.com/office/drawing/2016/5/13/chartex" xmlns:cx8="http://schemas.microsoft.com/office/drawing/2016/5/14/chartex" xmlns:mc="http://schemas.openxmlformats.org/markup-compatibility/2006" xmlns:aink="http://schemas.microsoft.com/office/drawing/2016/ink" xmlns:am3d="http://schemas.microsoft.com/office/drawing/2017/model3d" xmlns:o="urn:schemas-microsoft-com:office:office" xmlns:oel="http://schemas.microsoft.com/office/2019/extlst" xmlns:r="http://schemas.openxmlformats.org/officeDocument/2006/relationships" xmlns:m="http://schemas.openxmlformats.org/officeDocument/2006/math" xmlns:v="urn:schemas-microsoft-com:vml" xmlns:wp14="http://schemas.microsoft.com/office/word/2010/wordprocessingDrawing" xmlns:wp="http://schemas.openxmlformats.org/drawingml/2006/wordprocessingDrawing" xmlns:w10="urn:schemas-microsoft-com:office:word" xmlns:w="http://schemas.openxmlformats.org/wordprocessingml/2006/main" xmlns:w14="http://schemas.microsoft.com/office/word/2010/wordml" xmlns:w15="http://schemas.microsoft.com/office/word/2012/wordml" xmlns:w16cex="http://schemas.microsoft.com/office/word/2018/wordml/cex" xmlns:w16cid="http://schemas.microsoft.com/office/word/2016/wordml/cid" xmlns:w16="http://schemas.microsoft.com/office/word/2018/wordml" xmlns:w16du="http://schemas.microsoft.com/office/word/2023/wordml/word16du" xmlns:w16sdtdh="http://schemas.microsoft.com/office/word/2020/wordml/sdtdatahash" xmlns:w16sdtfl="http://schemas.microsoft.com/office/word/2024/wordml/sdtformatlock" xmlns:w16se="http://schemas.microsoft.com/office/word/2015/wordml/symex" xmlns:wpg="http://schemas.microsoft.com/office/word/2010/wordprocessingGroup" xmlns:wpi="http://schemas.microsoft.com/office/word/2010/wordprocessingInk" xmlns:wne="http://schemas.microsoft.com/office/word/2006/wordml" xmlns:wps="http://schemas.microsoft.com/office/word/2010/wordprocessingShape" mc:Ignorable="w14 w15 w16se w16cid w16 w16cex w16sdtdh w16sdtfl w16du wp14">
+<w:footnotes xmlns:wpc="http://schemas.microsoft.com/office/word/2010/wordprocessingCanvas" xmlns:cx="http://schemas.microsoft.com/office/drawing/2014/chartex" xmlns:cx1="http://schemas.microsoft.com/office/drawing/2015/9/8/chartex" xmlns:cx2="http://schemas.microsoft.com/office/drawing/2015/10/21/chartex" xmlns:cx3="http://schemas.microsoft.com/office/drawing/2016/5/9/chartex" xmlns:cx4="http://schemas.microsoft.com/office/drawing/2016/5/10/chartex" xmlns:cx5="http://schemas.microsoft.com/office/drawing/2016/5/11/chartex" xmlns:cx6="http://schemas.microsoft.com/office/drawing/2016/5/12/chartex" xmlns:cx7="http://schemas.microsoft.com/office/drawing/2016/5/13/chartex" xmlns:cx8="http://schemas.microsoft.com/office/drawing/2016/5/14/chartex" xmlns:mc="http://schemas.openxmlformats.org/markup-compatibility/2006" xmlns:aink="http://schemas.microsoft.com/office/drawing/2016/ink" xmlns:am3d="http://schemas.microsoft.com/office/drawing/2017/model3d" xmlns:o="urn:schemas-microsoft-com:office:office" xmlns:r="http://schemas.openxmlformats.org/officeDocument/2006/relationships" xmlns:m="http://schemas.openxmlformats.org/officeDocument/2006/math" xmlns:v="urn:schemas-microsoft-com:vml" xmlns:wp14="http://schemas.microsoft.com/office/word/2010/wordprocessingDrawing" xmlns:wp="http://schemas.openxmlformats.org/drawingml/2006/wordprocessingDrawing" xmlns:w10="urn:schemas-microsoft-com:office:word" xmlns:w="http://schemas.openxmlformats.org/wordprocessingml/2006/main" xmlns:w14="http://schemas.microsoft.com/office/word/2010/wordml" xmlns:w15="http://schemas.microsoft.com/office/word/2012/wordml" xmlns:w16cex="http://schemas.microsoft.com/office/word/2018/wordml/cex" xmlns:w16cid="http://schemas.microsoft.com/office/word/2016/wordml/cid" xmlns:w16="http://schemas.microsoft.com/office/word/2018/wordml" xmlns:w16sdtdh="http://schemas.microsoft.com/office/word/2020/wordml/sdtdatahash" xmlns:w16se="http://schemas.microsoft.com/office/word/2015/wordml/symex" xmlns:wpg="http://schemas.microsoft.com/office/word/2010/wordprocessingGroup" xmlns:wpi="http://schemas.microsoft.com/office/word/2010/wordprocessingInk" xmlns:wne="http://schemas.microsoft.com/office/word/2006/wordml" xmlns:wps="http://schemas.microsoft.com/office/word/2010/wordprocessingShape" mc:Ignorable="w14 w15 w16se w16cid w16 w16cex w16sdtdh wp14">
   <w:footnote w:type="separator" w:id="-1">
     <w:p>
       <w:r>
@@ -6287,7 +6408,7 @@
 </file>
 
 <file path=word/numbering.xml><?xml version="1.0" encoding="utf-8"?>
-<w:numbering xmlns:wpc="http://schemas.microsoft.com/office/word/2010/wordprocessingCanvas" xmlns:cx="http://schemas.microsoft.com/office/drawing/2014/chartex" xmlns:cx1="http://schemas.microsoft.com/office/drawing/2015/9/8/chartex" xmlns:cx2="http://schemas.microsoft.com/office/drawing/2015/10/21/chartex" xmlns:cx3="http://schemas.microsoft.com/office/drawing/2016/5/9/chartex" xmlns:cx4="http://schemas.microsoft.com/office/drawing/2016/5/10/chartex" xmlns:cx5="http://schemas.microsoft.com/office/drawing/2016/5/11/chartex" xmlns:cx6="http://schemas.microsoft.com/office/drawing/2016/5/12/chartex" xmlns:cx7="http://schemas.microsoft.com/office/drawing/2016/5/13/chartex" xmlns:cx8="http://schemas.microsoft.com/office/drawing/2016/5/14/chartex" xmlns:mc="http://schemas.openxmlformats.org/markup-compatibility/2006" xmlns:aink="http://schemas.microsoft.com/office/drawing/2016/ink" xmlns:am3d="http://schemas.microsoft.com/office/drawing/2017/model3d" xmlns:o="urn:schemas-microsoft-com:office:office" xmlns:oel="http://schemas.microsoft.com/office/2019/extlst" xmlns:r="http://schemas.openxmlformats.org/officeDocument/2006/relationships" xmlns:m="http://schemas.openxmlformats.org/officeDocument/2006/math" xmlns:v="urn:schemas-microsoft-com:vml" xmlns:wp14="http://schemas.microsoft.com/office/word/2010/wordprocessingDrawing" xmlns:wp="http://schemas.openxmlformats.org/drawingml/2006/wordprocessingDrawing" xmlns:w10="urn:schemas-microsoft-com:office:word" xmlns:w="http://schemas.openxmlformats.org/wordprocessingml/2006/main" xmlns:w14="http://schemas.microsoft.com/office/word/2010/wordml" xmlns:w15="http://schemas.microsoft.com/office/word/2012/wordml" xmlns:w16cex="http://schemas.microsoft.com/office/word/2018/wordml/cex" xmlns:w16cid="http://schemas.microsoft.com/office/word/2016/wordml/cid" xmlns:w16="http://schemas.microsoft.com/office/word/2018/wordml" xmlns:w16du="http://schemas.microsoft.com/office/word/2023/wordml/word16du" xmlns:w16sdtdh="http://schemas.microsoft.com/office/word/2020/wordml/sdtdatahash" xmlns:w16sdtfl="http://schemas.microsoft.com/office/word/2024/wordml/sdtformatlock" xmlns:w16se="http://schemas.microsoft.com/office/word/2015/wordml/symex" xmlns:wpg="http://schemas.microsoft.com/office/word/2010/wordprocessingGroup" xmlns:wpi="http://schemas.microsoft.com/office/word/2010/wordprocessingInk" xmlns:wne="http://schemas.microsoft.com/office/word/2006/wordml" xmlns:wps="http://schemas.microsoft.com/office/word/2010/wordprocessingShape" mc:Ignorable="w14 w15 w16se w16cid w16 w16cex w16sdtdh w16sdtfl w16du wp14">
+<w:numbering xmlns:wpc="http://schemas.microsoft.com/office/word/2010/wordprocessingCanvas" xmlns:cx="http://schemas.microsoft.com/office/drawing/2014/chartex" xmlns:cx1="http://schemas.microsoft.com/office/drawing/2015/9/8/chartex" xmlns:cx2="http://schemas.microsoft.com/office/drawing/2015/10/21/chartex" xmlns:cx3="http://schemas.microsoft.com/office/drawing/2016/5/9/chartex" xmlns:cx4="http://schemas.microsoft.com/office/drawing/2016/5/10/chartex" xmlns:cx5="http://schemas.microsoft.com/office/drawing/2016/5/11/chartex" xmlns:cx6="http://schemas.microsoft.com/office/drawing/2016/5/12/chartex" xmlns:cx7="http://schemas.microsoft.com/office/drawing/2016/5/13/chartex" xmlns:cx8="http://schemas.microsoft.com/office/drawing/2016/5/14/chartex" xmlns:mc="http://schemas.openxmlformats.org/markup-compatibility/2006" xmlns:aink="http://schemas.microsoft.com/office/drawing/2016/ink" xmlns:am3d="http://schemas.microsoft.com/office/drawing/2017/model3d" xmlns:o="urn:schemas-microsoft-com:office:office" xmlns:r="http://schemas.openxmlformats.org/officeDocument/2006/relationships" xmlns:m="http://schemas.openxmlformats.org/officeDocument/2006/math" xmlns:v="urn:schemas-microsoft-com:vml" xmlns:wp14="http://schemas.microsoft.com/office/word/2010/wordprocessingDrawing" xmlns:wp="http://schemas.openxmlformats.org/drawingml/2006/wordprocessingDrawing" xmlns:w10="urn:schemas-microsoft-com:office:word" xmlns:w="http://schemas.openxmlformats.org/wordprocessingml/2006/main" xmlns:w14="http://schemas.microsoft.com/office/word/2010/wordml" xmlns:w15="http://schemas.microsoft.com/office/word/2012/wordml" xmlns:w16cex="http://schemas.microsoft.com/office/word/2018/wordml/cex" xmlns:w16cid="http://schemas.microsoft.com/office/word/2016/wordml/cid" xmlns:w16="http://schemas.microsoft.com/office/word/2018/wordml" xmlns:w16sdtdh="http://schemas.microsoft.com/office/word/2020/wordml/sdtdatahash" xmlns:w16se="http://schemas.microsoft.com/office/word/2015/wordml/symex" xmlns:wpg="http://schemas.microsoft.com/office/word/2010/wordprocessingGroup" xmlns:wpi="http://schemas.microsoft.com/office/word/2010/wordprocessingInk" xmlns:wne="http://schemas.microsoft.com/office/word/2006/wordml" xmlns:wps="http://schemas.microsoft.com/office/word/2010/wordprocessingShape" mc:Ignorable="w14 w15 w16se w16cid w16 w16cex w16sdtdh wp14">
   <w:abstractNum w:abstractNumId="0" w15:restartNumberingAfterBreak="0">
     <w:nsid w:val="03377472"/>
     <w:multiLevelType w:val="multilevel"/>
@@ -9742,79 +9863,79 @@
       </w:rPr>
     </w:lvl>
   </w:abstractNum>
-  <w:num w:numId="1" w16cid:durableId="1335766792">
+  <w:num w:numId="1">
     <w:abstractNumId w:val="13"/>
   </w:num>
-  <w:num w:numId="2" w16cid:durableId="2044472782">
+  <w:num w:numId="2">
     <w:abstractNumId w:val="9"/>
   </w:num>
-  <w:num w:numId="3" w16cid:durableId="936450900">
+  <w:num w:numId="3">
     <w:abstractNumId w:val="24"/>
   </w:num>
-  <w:num w:numId="4" w16cid:durableId="893782350">
+  <w:num w:numId="4">
     <w:abstractNumId w:val="15"/>
   </w:num>
-  <w:num w:numId="5" w16cid:durableId="700207297">
+  <w:num w:numId="5">
     <w:abstractNumId w:val="0"/>
   </w:num>
-  <w:num w:numId="6" w16cid:durableId="1515999481">
+  <w:num w:numId="6">
     <w:abstractNumId w:val="2"/>
   </w:num>
-  <w:num w:numId="7" w16cid:durableId="1256983839">
+  <w:num w:numId="7">
     <w:abstractNumId w:val="1"/>
   </w:num>
-  <w:num w:numId="8" w16cid:durableId="2142918518">
+  <w:num w:numId="8">
     <w:abstractNumId w:val="7"/>
   </w:num>
-  <w:num w:numId="9" w16cid:durableId="1032995028">
+  <w:num w:numId="9">
     <w:abstractNumId w:val="22"/>
   </w:num>
-  <w:num w:numId="10" w16cid:durableId="895629737">
+  <w:num w:numId="10">
     <w:abstractNumId w:val="3"/>
   </w:num>
-  <w:num w:numId="11" w16cid:durableId="1912691514">
+  <w:num w:numId="11">
     <w:abstractNumId w:val="11"/>
   </w:num>
-  <w:num w:numId="12" w16cid:durableId="1348796588">
+  <w:num w:numId="12">
     <w:abstractNumId w:val="12"/>
   </w:num>
-  <w:num w:numId="13" w16cid:durableId="1473407559">
+  <w:num w:numId="13">
     <w:abstractNumId w:val="4"/>
   </w:num>
-  <w:num w:numId="14" w16cid:durableId="851145423">
+  <w:num w:numId="14">
     <w:abstractNumId w:val="20"/>
   </w:num>
-  <w:num w:numId="15" w16cid:durableId="353191472">
+  <w:num w:numId="15">
     <w:abstractNumId w:val="8"/>
   </w:num>
-  <w:num w:numId="16" w16cid:durableId="1546403876">
+  <w:num w:numId="16">
     <w:abstractNumId w:val="19"/>
   </w:num>
-  <w:num w:numId="17" w16cid:durableId="1528175088">
+  <w:num w:numId="17">
     <w:abstractNumId w:val="10"/>
   </w:num>
-  <w:num w:numId="18" w16cid:durableId="1216744948">
+  <w:num w:numId="18">
     <w:abstractNumId w:val="23"/>
   </w:num>
-  <w:num w:numId="19" w16cid:durableId="645814881">
+  <w:num w:numId="19">
     <w:abstractNumId w:val="6"/>
   </w:num>
-  <w:num w:numId="20" w16cid:durableId="244607950">
+  <w:num w:numId="20">
     <w:abstractNumId w:val="18"/>
   </w:num>
-  <w:num w:numId="21" w16cid:durableId="1794251277">
+  <w:num w:numId="21">
     <w:abstractNumId w:val="5"/>
   </w:num>
-  <w:num w:numId="22" w16cid:durableId="1408114739">
+  <w:num w:numId="22">
     <w:abstractNumId w:val="16"/>
   </w:num>
-  <w:num w:numId="23" w16cid:durableId="490484723">
+  <w:num w:numId="23">
     <w:abstractNumId w:val="14"/>
   </w:num>
-  <w:num w:numId="24" w16cid:durableId="1774008059">
+  <w:num w:numId="24">
     <w:abstractNumId w:val="21"/>
   </w:num>
-  <w:num w:numId="25" w16cid:durableId="2052681473">
+  <w:num w:numId="25">
     <w:abstractNumId w:val="17"/>
   </w:num>
   <w:numIdMacAtCleanup w:val="25"/>
@@ -9822,7 +9943,7 @@
 </file>
 
 <file path=word/styles.xml><?xml version="1.0" encoding="utf-8"?>
-<w:styles xmlns:mc="http://schemas.openxmlformats.org/markup-compatibility/2006" xmlns:r="http://schemas.openxmlformats.org/officeDocument/2006/relationships" xmlns:w="http://schemas.openxmlformats.org/wordprocessingml/2006/main" xmlns:w14="http://schemas.microsoft.com/office/word/2010/wordml" xmlns:w15="http://schemas.microsoft.com/office/word/2012/wordml" xmlns:w16cex="http://schemas.microsoft.com/office/word/2018/wordml/cex" xmlns:w16cid="http://schemas.microsoft.com/office/word/2016/wordml/cid" xmlns:w16="http://schemas.microsoft.com/office/word/2018/wordml" xmlns:w16du="http://schemas.microsoft.com/office/word/2023/wordml/word16du" xmlns:w16sdtdh="http://schemas.microsoft.com/office/word/2020/wordml/sdtdatahash" xmlns:w16sdtfl="http://schemas.microsoft.com/office/word/2024/wordml/sdtformatlock" xmlns:w16se="http://schemas.microsoft.com/office/word/2015/wordml/symex" mc:Ignorable="w14 w15 w16se w16cid w16 w16cex w16sdtdh w16sdtfl w16du">
+<w:styles xmlns:mc="http://schemas.openxmlformats.org/markup-compatibility/2006" xmlns:r="http://schemas.openxmlformats.org/officeDocument/2006/relationships" xmlns:w="http://schemas.openxmlformats.org/wordprocessingml/2006/main" xmlns:w14="http://schemas.microsoft.com/office/word/2010/wordml" xmlns:w15="http://schemas.microsoft.com/office/word/2012/wordml" xmlns:w16cex="http://schemas.microsoft.com/office/word/2018/wordml/cex" xmlns:w16cid="http://schemas.microsoft.com/office/word/2016/wordml/cid" xmlns:w16="http://schemas.microsoft.com/office/word/2018/wordml" xmlns:w16sdtdh="http://schemas.microsoft.com/office/word/2020/wordml/sdtdatahash" xmlns:w16se="http://schemas.microsoft.com/office/word/2015/wordml/symex" mc:Ignorable="w14 w15 w16se w16cid w16 w16cex w16sdtdh">
   <w:docDefaults>
     <w:rPrDefault>
       <w:rPr>
@@ -10222,7 +10343,7 @@
     <w:lsdException w:name="Unresolved Mention" w:semiHidden="1" w:unhideWhenUsed="1"/>
     <w:lsdException w:name="Smart Link" w:semiHidden="1" w:unhideWhenUsed="1"/>
   </w:latentStyles>
-  <w:style w:type="paragraph" w:default="1" w:styleId="Normal">
+  <w:style w:type="paragraph" w:default="1" w:styleId="a">
     <w:name w:val="Normal"/>
     <w:qFormat/>
     <w:rPr>
@@ -10231,11 +10352,11 @@
       <w:lang w:val="en-GB" w:eastAsia="en-US"/>
     </w:rPr>
   </w:style>
-  <w:style w:type="paragraph" w:styleId="Heading1">
+  <w:style w:type="paragraph" w:styleId="1">
     <w:name w:val="heading 1"/>
-    <w:basedOn w:val="Normal"/>
-    <w:next w:val="Normal"/>
-    <w:link w:val="Heading1Char"/>
+    <w:basedOn w:val="a"/>
+    <w:next w:val="a"/>
+    <w:link w:val="10"/>
     <w:uiPriority w:val="9"/>
     <w:qFormat/>
     <w:rsid w:val="00915E78"/>
@@ -10252,11 +10373,11 @@
       <w:szCs w:val="32"/>
     </w:rPr>
   </w:style>
-  <w:style w:type="paragraph" w:styleId="Heading2">
+  <w:style w:type="paragraph" w:styleId="2">
     <w:name w:val="heading 2"/>
-    <w:basedOn w:val="Normal"/>
-    <w:next w:val="Normal"/>
-    <w:link w:val="Heading2Char"/>
+    <w:basedOn w:val="a"/>
+    <w:next w:val="a"/>
+    <w:link w:val="20"/>
     <w:uiPriority w:val="9"/>
     <w:unhideWhenUsed/>
     <w:qFormat/>
@@ -10274,10 +10395,10 @@
       <w:szCs w:val="26"/>
     </w:rPr>
   </w:style>
-  <w:style w:type="paragraph" w:styleId="Heading3">
+  <w:style w:type="paragraph" w:styleId="3">
     <w:name w:val="heading 3"/>
-    <w:basedOn w:val="Normal"/>
-    <w:link w:val="Heading3Char"/>
+    <w:basedOn w:val="a"/>
+    <w:link w:val="30"/>
     <w:uiPriority w:val="9"/>
     <w:qFormat/>
     <w:rsid w:val="00602521"/>
@@ -10303,13 +10424,13 @@
       <w:lang w:val="en-HK" w:eastAsia="zh-TW"/>
     </w:rPr>
   </w:style>
-  <w:style w:type="character" w:default="1" w:styleId="DefaultParagraphFont">
+  <w:style w:type="character" w:default="1" w:styleId="a0">
     <w:name w:val="Default Paragraph Font"/>
     <w:uiPriority w:val="1"/>
     <w:semiHidden/>
     <w:unhideWhenUsed/>
   </w:style>
-  <w:style w:type="table" w:default="1" w:styleId="TableNormal">
+  <w:style w:type="table" w:default="1" w:styleId="a1">
     <w:name w:val="Normal Table"/>
     <w:uiPriority w:val="99"/>
     <w:semiHidden/>
@@ -10324,13 +10445,13 @@
       </w:tblCellMar>
     </w:tblPr>
   </w:style>
-  <w:style w:type="numbering" w:default="1" w:styleId="NoList">
+  <w:style w:type="numbering" w:default="1" w:styleId="a2">
     <w:name w:val="No List"/>
     <w:uiPriority w:val="99"/>
     <w:semiHidden/>
     <w:unhideWhenUsed/>
   </w:style>
-  <w:style w:type="character" w:styleId="Hyperlink">
+  <w:style w:type="character" w:styleId="a3">
     <w:name w:val="Hyperlink"/>
     <w:rPr>
       <w:u w:val="single"/>
@@ -10387,10 +10508,10 @@
       </w:numPr>
     </w:pPr>
   </w:style>
-  <w:style w:type="paragraph" w:styleId="BalloonText">
+  <w:style w:type="paragraph" w:styleId="a4">
     <w:name w:val="Balloon Text"/>
-    <w:basedOn w:val="Normal"/>
-    <w:link w:val="BalloonTextChar"/>
+    <w:basedOn w:val="a"/>
+    <w:link w:val="a5"/>
     <w:uiPriority w:val="99"/>
     <w:semiHidden/>
     <w:unhideWhenUsed/>
@@ -10400,10 +10521,10 @@
       <w:szCs w:val="18"/>
     </w:rPr>
   </w:style>
-  <w:style w:type="character" w:customStyle="1" w:styleId="BalloonTextChar">
-    <w:name w:val="Balloon Text Char"/>
-    <w:basedOn w:val="DefaultParagraphFont"/>
-    <w:link w:val="BalloonText"/>
+  <w:style w:type="character" w:customStyle="1" w:styleId="a5">
+    <w:name w:val="註解方塊文字 字元"/>
+    <w:basedOn w:val="a0"/>
+    <w:link w:val="a4"/>
     <w:uiPriority w:val="99"/>
     <w:semiHidden/>
     <w:rsid w:val="00100227"/>
@@ -10413,10 +10534,10 @@
       <w:lang w:val="en-US" w:eastAsia="en-US"/>
     </w:rPr>
   </w:style>
-  <w:style w:type="paragraph" w:styleId="Footer">
+  <w:style w:type="paragraph" w:styleId="a6">
     <w:name w:val="footer"/>
-    <w:basedOn w:val="Normal"/>
-    <w:link w:val="FooterChar"/>
+    <w:basedOn w:val="a"/>
+    <w:link w:val="a7"/>
     <w:uiPriority w:val="99"/>
     <w:unhideWhenUsed/>
     <w:rsid w:val="00225AE4"/>
@@ -10427,10 +10548,10 @@
       </w:tabs>
     </w:pPr>
   </w:style>
-  <w:style w:type="character" w:customStyle="1" w:styleId="FooterChar">
-    <w:name w:val="Footer Char"/>
-    <w:basedOn w:val="DefaultParagraphFont"/>
-    <w:link w:val="Footer"/>
+  <w:style w:type="character" w:customStyle="1" w:styleId="a7">
+    <w:name w:val="頁尾 字元"/>
+    <w:basedOn w:val="a0"/>
+    <w:link w:val="a6"/>
     <w:uiPriority w:val="99"/>
     <w:rsid w:val="00225AE4"/>
     <w:rPr>
@@ -10439,9 +10560,9 @@
       <w:lang w:val="en-GB" w:eastAsia="en-US"/>
     </w:rPr>
   </w:style>
-  <w:style w:type="character" w:styleId="PageNumber">
+  <w:style w:type="character" w:styleId="a8">
     <w:name w:val="page number"/>
-    <w:basedOn w:val="DefaultParagraphFont"/>
+    <w:basedOn w:val="a0"/>
     <w:uiPriority w:val="99"/>
     <w:semiHidden/>
     <w:unhideWhenUsed/>
@@ -10449,7 +10570,7 @@
   </w:style>
   <w:style w:type="character" w:customStyle="1" w:styleId="UnresolvedMention1">
     <w:name w:val="Unresolved Mention1"/>
-    <w:basedOn w:val="DefaultParagraphFont"/>
+    <w:basedOn w:val="a0"/>
     <w:uiPriority w:val="99"/>
     <w:semiHidden/>
     <w:unhideWhenUsed/>
@@ -10459,9 +10580,9 @@
       <w:shd w:val="clear" w:color="auto" w:fill="E1DFDD"/>
     </w:rPr>
   </w:style>
-  <w:style w:type="character" w:styleId="CommentReference">
+  <w:style w:type="character" w:styleId="a9">
     <w:name w:val="annotation reference"/>
-    <w:basedOn w:val="DefaultParagraphFont"/>
+    <w:basedOn w:val="a0"/>
     <w:uiPriority w:val="99"/>
     <w:semiHidden/>
     <w:unhideWhenUsed/>
@@ -10471,10 +10592,10 @@
       <w:szCs w:val="16"/>
     </w:rPr>
   </w:style>
-  <w:style w:type="paragraph" w:styleId="CommentText">
+  <w:style w:type="paragraph" w:styleId="aa">
     <w:name w:val="annotation text"/>
-    <w:basedOn w:val="Normal"/>
-    <w:link w:val="CommentTextChar"/>
+    <w:basedOn w:val="a"/>
+    <w:link w:val="ab"/>
     <w:uiPriority w:val="99"/>
     <w:semiHidden/>
     <w:unhideWhenUsed/>
@@ -10484,10 +10605,10 @@
       <w:szCs w:val="20"/>
     </w:rPr>
   </w:style>
-  <w:style w:type="character" w:customStyle="1" w:styleId="CommentTextChar">
-    <w:name w:val="Comment Text Char"/>
-    <w:basedOn w:val="DefaultParagraphFont"/>
-    <w:link w:val="CommentText"/>
+  <w:style w:type="character" w:customStyle="1" w:styleId="ab">
+    <w:name w:val="註解文字 字元"/>
+    <w:basedOn w:val="a0"/>
+    <w:link w:val="aa"/>
     <w:uiPriority w:val="99"/>
     <w:semiHidden/>
     <w:rsid w:val="00660014"/>
@@ -10495,11 +10616,11 @@
       <w:lang w:val="en-GB" w:eastAsia="en-US"/>
     </w:rPr>
   </w:style>
-  <w:style w:type="paragraph" w:styleId="CommentSubject">
+  <w:style w:type="paragraph" w:styleId="ac">
     <w:name w:val="annotation subject"/>
-    <w:basedOn w:val="CommentText"/>
-    <w:next w:val="CommentText"/>
-    <w:link w:val="CommentSubjectChar"/>
+    <w:basedOn w:val="aa"/>
+    <w:next w:val="aa"/>
+    <w:link w:val="ad"/>
     <w:uiPriority w:val="99"/>
     <w:semiHidden/>
     <w:unhideWhenUsed/>
@@ -10509,10 +10630,10 @@
       <w:bCs/>
     </w:rPr>
   </w:style>
-  <w:style w:type="character" w:customStyle="1" w:styleId="CommentSubjectChar">
-    <w:name w:val="Comment Subject Char"/>
-    <w:basedOn w:val="CommentTextChar"/>
-    <w:link w:val="CommentSubject"/>
+  <w:style w:type="character" w:customStyle="1" w:styleId="ad">
+    <w:name w:val="註解主旨 字元"/>
+    <w:basedOn w:val="ab"/>
+    <w:link w:val="ac"/>
     <w:uiPriority w:val="99"/>
     <w:semiHidden/>
     <w:rsid w:val="00660014"/>
@@ -10522,10 +10643,10 @@
       <w:lang w:val="en-GB" w:eastAsia="en-US"/>
     </w:rPr>
   </w:style>
-  <w:style w:type="paragraph" w:styleId="Header">
+  <w:style w:type="paragraph" w:styleId="ae">
     <w:name w:val="header"/>
-    <w:basedOn w:val="Normal"/>
-    <w:link w:val="HeaderChar"/>
+    <w:basedOn w:val="a"/>
+    <w:link w:val="af"/>
     <w:uiPriority w:val="99"/>
     <w:unhideWhenUsed/>
     <w:rsid w:val="007F2022"/>
@@ -10536,10 +10657,10 @@
       </w:tabs>
     </w:pPr>
   </w:style>
-  <w:style w:type="character" w:customStyle="1" w:styleId="HeaderChar">
-    <w:name w:val="Header Char"/>
-    <w:basedOn w:val="DefaultParagraphFont"/>
-    <w:link w:val="Header"/>
+  <w:style w:type="character" w:customStyle="1" w:styleId="af">
+    <w:name w:val="頁首 字元"/>
+    <w:basedOn w:val="a0"/>
+    <w:link w:val="ae"/>
     <w:uiPriority w:val="99"/>
     <w:rsid w:val="007F2022"/>
     <w:rPr>
@@ -10548,9 +10669,9 @@
       <w:lang w:val="en-GB" w:eastAsia="en-US"/>
     </w:rPr>
   </w:style>
-  <w:style w:type="paragraph" w:styleId="ListParagraph">
+  <w:style w:type="paragraph" w:styleId="af0">
     <w:name w:val="List Paragraph"/>
-    <w:basedOn w:val="Normal"/>
+    <w:basedOn w:val="a"/>
     <w:uiPriority w:val="34"/>
     <w:qFormat/>
     <w:rsid w:val="007F2022"/>
@@ -10559,9 +10680,9 @@
       <w:contextualSpacing/>
     </w:pPr>
   </w:style>
-  <w:style w:type="table" w:styleId="TableGrid">
+  <w:style w:type="table" w:styleId="af1">
     <w:name w:val="Table Grid"/>
-    <w:basedOn w:val="TableNormal"/>
+    <w:basedOn w:val="a1"/>
     <w:uiPriority w:val="39"/>
     <w:rsid w:val="009513CF"/>
     <w:tblPr>
@@ -10575,10 +10696,10 @@
       </w:tblBorders>
     </w:tblPr>
   </w:style>
-  <w:style w:type="character" w:customStyle="1" w:styleId="Heading3Char">
-    <w:name w:val="Heading 3 Char"/>
-    <w:basedOn w:val="DefaultParagraphFont"/>
-    <w:link w:val="Heading3"/>
+  <w:style w:type="character" w:customStyle="1" w:styleId="30">
+    <w:name w:val="標題 3 字元"/>
+    <w:basedOn w:val="a0"/>
+    <w:link w:val="3"/>
     <w:uiPriority w:val="9"/>
     <w:rsid w:val="00602521"/>
     <w:rPr>
@@ -10590,9 +10711,9 @@
       <w:bdr w:val="none" w:sz="0" w:space="0" w:color="auto"/>
     </w:rPr>
   </w:style>
-  <w:style w:type="paragraph" w:styleId="NormalWeb">
+  <w:style w:type="paragraph" w:styleId="Web">
     <w:name w:val="Normal (Web)"/>
-    <w:basedOn w:val="Normal"/>
+    <w:basedOn w:val="a"/>
     <w:uiPriority w:val="99"/>
     <w:unhideWhenUsed/>
     <w:rsid w:val="00602521"/>
@@ -10613,9 +10734,9 @@
       <w:lang w:val="en-HK" w:eastAsia="zh-TW"/>
     </w:rPr>
   </w:style>
-  <w:style w:type="character" w:styleId="Strong">
+  <w:style w:type="character" w:styleId="af2">
     <w:name w:val="Strong"/>
-    <w:basedOn w:val="DefaultParagraphFont"/>
+    <w:basedOn w:val="a0"/>
     <w:uiPriority w:val="22"/>
     <w:qFormat/>
     <w:rsid w:val="00602521"/>
@@ -10624,10 +10745,10 @@
       <w:bCs/>
     </w:rPr>
   </w:style>
-  <w:style w:type="character" w:customStyle="1" w:styleId="Heading1Char">
-    <w:name w:val="Heading 1 Char"/>
-    <w:basedOn w:val="DefaultParagraphFont"/>
-    <w:link w:val="Heading1"/>
+  <w:style w:type="character" w:customStyle="1" w:styleId="10">
+    <w:name w:val="標題 1 字元"/>
+    <w:basedOn w:val="a0"/>
+    <w:link w:val="1"/>
     <w:uiPriority w:val="9"/>
     <w:rsid w:val="00915E78"/>
     <w:rPr>
@@ -10638,10 +10759,10 @@
       <w:lang w:val="en-GB" w:eastAsia="en-US"/>
     </w:rPr>
   </w:style>
-  <w:style w:type="character" w:customStyle="1" w:styleId="Heading2Char">
-    <w:name w:val="Heading 2 Char"/>
-    <w:basedOn w:val="DefaultParagraphFont"/>
-    <w:link w:val="Heading2"/>
+  <w:style w:type="character" w:customStyle="1" w:styleId="20">
+    <w:name w:val="標題 2 字元"/>
+    <w:basedOn w:val="a0"/>
+    <w:link w:val="2"/>
     <w:uiPriority w:val="9"/>
     <w:rsid w:val="008C53BD"/>
     <w:rPr>
@@ -10699,12 +10820,12 @@
     <a:fontScheme name="Blank">
       <a:majorFont>
         <a:latin typeface="Helvetica Neue"/>
-        <a:ea typeface="Helvetica Neue"/>
+        <a:ea typeface="細明體"/>
         <a:cs typeface="Helvetica Neue"/>
       </a:majorFont>
       <a:minorFont>
         <a:latin typeface="Helvetica Neue"/>
-        <a:ea typeface="Helvetica Neue"/>
+        <a:ea typeface="新細明體"/>
         <a:cs typeface="Helvetica Neue"/>
       </a:minorFont>
     </a:fontScheme>

</xml_diff>